<commit_message>
Add secure Claude analysis flow and ad-hoc question tools
Enable instructors to run AI summaries safely from admin via a server-side Claude endpoint, while adding flexible ad-hoc question creation and related UI/aggregation updates for live teaching.

Made-with: Cursor
</commit_message>
<xml_diff>
--- a/Alza_Platebni_Ekonomika_OnePager_v2.docx
+++ b/Alza_Platebni_Ekonomika_OnePager_v2.docx
@@ -38,16 +38,9 @@
           <w:szCs w:val="18"/>
           <w:lang w:val="cs-CZ"/>
         </w:rPr>
-        <w:t>Celý text tohoto dokumentu byl vytvořen pomocí ChatGPT. Závěry nebyly pouze drobně upraveny.</w:t>
-      </w:r>
-    </w:p>
-    <w:p>
-      <w:pPr>
-        <w:spacing w:after="60"/>
-        <w:rPr>
-          <w:lang w:val="cs-CZ"/>
-        </w:rPr>
-      </w:pPr>
+        <w:t xml:space="preserve">Celý text tohoto dokumentu byl vytvořen pomocí </w:t>
+      </w:r>
+      <w:proofErr w:type="spellStart"/>
       <w:r>
         <w:rPr>
           <w:i/>
@@ -57,7 +50,62 @@
           <w:szCs w:val="18"/>
           <w:lang w:val="cs-CZ"/>
         </w:rPr>
-        <w:t>Vizualizace jsou z webu www.ceska-ecommerce.cz/ kterou provozuje Shoptet, a.s.</w:t>
+        <w:t>ChatGPT</w:t>
+      </w:r>
+      <w:proofErr w:type="spellEnd"/>
+      <w:r>
+        <w:rPr>
+          <w:i/>
+          <w:iCs/>
+          <w:color w:val="808080"/>
+          <w:sz w:val="18"/>
+          <w:szCs w:val="18"/>
+          <w:lang w:val="cs-CZ"/>
+        </w:rPr>
+        <w:t>. Závěry nebyly pouze drobně upraveny.</w:t>
+      </w:r>
+    </w:p>
+    <w:p>
+      <w:pPr>
+        <w:spacing w:after="60"/>
+        <w:rPr>
+          <w:lang w:val="cs-CZ"/>
+        </w:rPr>
+      </w:pPr>
+      <w:r>
+        <w:rPr>
+          <w:i/>
+          <w:iCs/>
+          <w:color w:val="808080"/>
+          <w:sz w:val="18"/>
+          <w:szCs w:val="18"/>
+          <w:lang w:val="cs-CZ"/>
+        </w:rPr>
+        <w:t xml:space="preserve">Vizualizace jsou z webu www.ceska-ecommerce.cz/ kterou provozuje </w:t>
+      </w:r>
+      <w:proofErr w:type="spellStart"/>
+      <w:r>
+        <w:rPr>
+          <w:i/>
+          <w:iCs/>
+          <w:color w:val="808080"/>
+          <w:sz w:val="18"/>
+          <w:szCs w:val="18"/>
+          <w:lang w:val="cs-CZ"/>
+        </w:rPr>
+        <w:t>Shoptet</w:t>
+      </w:r>
+      <w:proofErr w:type="spellEnd"/>
+      <w:r>
+        <w:rPr>
+          <w:i/>
+          <w:iCs/>
+          <w:color w:val="808080"/>
+          <w:sz w:val="18"/>
+          <w:szCs w:val="18"/>
+          <w:lang w:val="cs-CZ"/>
+        </w:rPr>
+        <w:t>, a.s.</w:t>
       </w:r>
     </w:p>
     <w:p>
@@ -89,7 +137,35 @@
         <w:rPr>
           <w:lang w:val="cs-CZ"/>
         </w:rPr>
-        <w:t>Alza.cz je největší e-shop v České republice a jeden z klíčových hráčů středoevropského online trhu. Vznikla v roce 1994 jako Alzasoft a od původního prodeje počítačů se postupně rozšířila na široké portfolio zboží – od elektroniky a domácích spotřebičů až po kosmetiku, sportovní vybavení, hračky nebo chovatelské potřeby. Působí i na Slovensku, v Maďarsku, Rakousku a Německu a provozuje vlastní výdejní síť AlzaBoxů.</w:t>
+        <w:t xml:space="preserve">Alza.cz je největší e-shop v České republice a jeden z klíčových hráčů středoevropského online trhu. Vznikla v roce 1994 jako </w:t>
+      </w:r>
+      <w:proofErr w:type="spellStart"/>
+      <w:r>
+        <w:rPr>
+          <w:lang w:val="cs-CZ"/>
+        </w:rPr>
+        <w:t>Alzasoft</w:t>
+      </w:r>
+      <w:proofErr w:type="spellEnd"/>
+      <w:r>
+        <w:rPr>
+          <w:lang w:val="cs-CZ"/>
+        </w:rPr>
+        <w:t xml:space="preserve"> a od původního prodeje počítačů se postupně rozšířila na široké portfolio zboží – od elektroniky a domácích spotřebičů až po kosmetiku, sportovní vybavení, hračky nebo chovatelské potřeby. Působí i na Slovensku, v Maďarsku, Rakousku a Německu a provozuje vlastní výdejní síť </w:t>
+      </w:r>
+      <w:proofErr w:type="spellStart"/>
+      <w:r>
+        <w:rPr>
+          <w:lang w:val="cs-CZ"/>
+        </w:rPr>
+        <w:t>AlzaBoxů</w:t>
+      </w:r>
+      <w:proofErr w:type="spellEnd"/>
+      <w:r>
+        <w:rPr>
+          <w:lang w:val="cs-CZ"/>
+        </w:rPr>
+        <w:t>.</w:t>
       </w:r>
     </w:p>
     <w:p>
@@ -103,7 +179,63 @@
         <w:rPr>
           <w:lang w:val="cs-CZ"/>
         </w:rPr>
-        <w:t>Podle odhadů tvoří Alza přibližně 15–20 % českého e-commerce trhu (Expando), jehož hodnota se pohybuje kolem 190 miliard Kč ročně. Obrat Alzy v roce 2021 dosáhl cca 45 miliard Kč a čistý zisk 2,5 miliardy Kč, což odpovídá čisté marži kolem 5–6 % (HelgiLibrary). Sortiment je široký – elektronika, IT, domácí spotřebiče, hobby i služby – a proto je maržovost různá: tvrdé elektro má nízké marže, doplňky a služby vyšší.</w:t>
+        <w:t>Podle odhadů tvoří Alza přibližně 15–20 % českého e-</w:t>
+      </w:r>
+      <w:proofErr w:type="spellStart"/>
+      <w:r>
+        <w:rPr>
+          <w:lang w:val="cs-CZ"/>
+        </w:rPr>
+        <w:t>commerce</w:t>
+      </w:r>
+      <w:proofErr w:type="spellEnd"/>
+      <w:r>
+        <w:rPr>
+          <w:lang w:val="cs-CZ"/>
+        </w:rPr>
+        <w:t xml:space="preserve"> trhu (</w:t>
+      </w:r>
+      <w:proofErr w:type="spellStart"/>
+      <w:r>
+        <w:rPr>
+          <w:lang w:val="cs-CZ"/>
+        </w:rPr>
+        <w:t>Expando</w:t>
+      </w:r>
+      <w:proofErr w:type="spellEnd"/>
+      <w:r>
+        <w:rPr>
+          <w:lang w:val="cs-CZ"/>
+        </w:rPr>
+        <w:t>), jehož hodnota se pohybuje kolem 190 miliard Kč ročně. Obrat Alzy v roce 2021 dosáhl cca 45 miliard Kč a čistý zisk 2,5 miliardy Kč, což odpovídá čisté marži kolem 5–6 % (</w:t>
+      </w:r>
+      <w:proofErr w:type="spellStart"/>
+      <w:r>
+        <w:rPr>
+          <w:lang w:val="cs-CZ"/>
+        </w:rPr>
+        <w:t>HelgiLibrary</w:t>
+      </w:r>
+      <w:proofErr w:type="spellEnd"/>
+      <w:r>
+        <w:rPr>
+          <w:lang w:val="cs-CZ"/>
+        </w:rPr>
+        <w:t xml:space="preserve">). Sortiment je široký – elektronika, IT, domácí spotřebiče, hobby i služby – a proto je </w:t>
+      </w:r>
+      <w:proofErr w:type="spellStart"/>
+      <w:r>
+        <w:rPr>
+          <w:lang w:val="cs-CZ"/>
+        </w:rPr>
+        <w:t>maržovost</w:t>
+      </w:r>
+      <w:proofErr w:type="spellEnd"/>
+      <w:r>
+        <w:rPr>
+          <w:lang w:val="cs-CZ"/>
+        </w:rPr>
+        <w:t xml:space="preserve"> různá: tvrdé elektro má nízké marže, doplňky a služby vyšší.</w:t>
       </w:r>
     </w:p>
     <w:p>
@@ -131,7 +263,35 @@
         <w:rPr>
           <w:lang w:val="cs-CZ"/>
         </w:rPr>
-        <w:t>Alza a dnešní CZ e-commerce nabízí různé formy doručení. Zákazníci mohou využít AlzaBoxy dostupné 24/7, osobní odběr na pobočkách nebo výdejních místech, případně expresní doručení na adresu. Tato flexibilní logistika ovlivňuje ekonomiku vratek, dobírek i náklady na dopravu (Alza.cz).</w:t>
+        <w:t>Alza a dnešní CZ e-</w:t>
+      </w:r>
+      <w:proofErr w:type="spellStart"/>
+      <w:r>
+        <w:rPr>
+          <w:lang w:val="cs-CZ"/>
+        </w:rPr>
+        <w:t>commerce</w:t>
+      </w:r>
+      <w:proofErr w:type="spellEnd"/>
+      <w:r>
+        <w:rPr>
+          <w:lang w:val="cs-CZ"/>
+        </w:rPr>
+        <w:t xml:space="preserve"> nabízí různé formy doručení. Zákazníci mohou využít </w:t>
+      </w:r>
+      <w:proofErr w:type="spellStart"/>
+      <w:r>
+        <w:rPr>
+          <w:lang w:val="cs-CZ"/>
+        </w:rPr>
+        <w:t>AlzaBoxy</w:t>
+      </w:r>
+      <w:proofErr w:type="spellEnd"/>
+      <w:r>
+        <w:rPr>
+          <w:lang w:val="cs-CZ"/>
+        </w:rPr>
+        <w:t xml:space="preserve"> dostupné 24/7, osobní odběr na pobočkách nebo výdejních místech, případně expresní doručení na adresu. Tato flexibilní logistika ovlivňuje ekonomiku vratek, dobírek i náklady na dopravu (Alza.cz).</w:t>
       </w:r>
     </w:p>
     <w:p>
@@ -150,7 +310,7 @@
     </w:p>
     <w:tbl>
       <w:tblPr>
-        <w:tblW w:w="9746" w:type="dxa"/>
+        <w:tblW w:w="9744" w:type="dxa"/>
         <w:tblBorders>
           <w:top w:val="single" w:sz="4" w:space="0" w:color="auto"/>
           <w:left w:val="single" w:sz="4" w:space="0" w:color="auto"/>
@@ -166,23 +326,17 @@
         <w:tblLook w:val="0000" w:firstRow="0" w:lastRow="0" w:firstColumn="0" w:lastColumn="0" w:noHBand="0" w:noVBand="0"/>
       </w:tblPr>
       <w:tblGrid>
-        <w:gridCol w:w="2055"/>
-        <w:gridCol w:w="1307"/>
-        <w:gridCol w:w="1526"/>
-        <w:gridCol w:w="2054"/>
-        <w:gridCol w:w="1301"/>
-        <w:gridCol w:w="1503"/>
+        <w:gridCol w:w="1784"/>
+        <w:gridCol w:w="1132"/>
+        <w:gridCol w:w="1523"/>
+        <w:gridCol w:w="2095"/>
+        <w:gridCol w:w="1605"/>
+        <w:gridCol w:w="1605"/>
       </w:tblGrid>
       <w:tr>
-        <w:tblPrEx>
-          <w:tblCellMar>
-            <w:top w:w="0" w:type="dxa"/>
-            <w:bottom w:w="0" w:type="dxa"/>
-          </w:tblCellMar>
-        </w:tblPrEx>
-        <w:tc>
-          <w:tcPr>
-            <w:tcW w:w="2200" w:type="dxa"/>
+        <w:tc>
+          <w:tcPr>
+            <w:tcW w:w="1784" w:type="dxa"/>
             <w:tcBorders>
               <w:top w:val="single" w:sz="1" w:space="0" w:color="2E75B6"/>
               <w:left w:val="single" w:sz="1" w:space="0" w:color="2E75B6"/>
@@ -217,7 +371,7 @@
         </w:tc>
         <w:tc>
           <w:tcPr>
-            <w:tcW w:w="1400" w:type="dxa"/>
+            <w:tcW w:w="1132" w:type="dxa"/>
             <w:tcBorders>
               <w:top w:val="single" w:sz="1" w:space="0" w:color="2E75B6"/>
               <w:left w:val="single" w:sz="1" w:space="0" w:color="2E75B6"/>
@@ -252,7 +406,7 @@
         </w:tc>
         <w:tc>
           <w:tcPr>
-            <w:tcW w:w="1600" w:type="dxa"/>
+            <w:tcW w:w="1523" w:type="dxa"/>
             <w:tcBorders>
               <w:top w:val="single" w:sz="1" w:space="0" w:color="2E75B6"/>
               <w:left w:val="single" w:sz="1" w:space="0" w:color="2E75B6"/>
@@ -287,7 +441,7 @@
         </w:tc>
         <w:tc>
           <w:tcPr>
-            <w:tcW w:w="2200" w:type="dxa"/>
+            <w:tcW w:w="2095" w:type="dxa"/>
             <w:tcBorders>
               <w:top w:val="single" w:sz="1" w:space="0" w:color="2E75B6"/>
               <w:left w:val="single" w:sz="1" w:space="0" w:color="2E75B6"/>
@@ -316,13 +470,35 @@
                 <w:szCs w:val="18"/>
                 <w:lang w:val="cs-CZ"/>
               </w:rPr>
-              <w:t>Dopad na cash-flow e-shopu</w:t>
+              <w:t>Dopad na cash-</w:t>
             </w:r>
-          </w:p>
-        </w:tc>
-        <w:tc>
-          <w:tcPr>
-            <w:tcW w:w="1400" w:type="dxa"/>
+            <w:proofErr w:type="spellStart"/>
+            <w:r>
+              <w:rPr>
+                <w:b/>
+                <w:bCs/>
+                <w:sz w:val="18"/>
+                <w:szCs w:val="18"/>
+                <w:lang w:val="cs-CZ"/>
+              </w:rPr>
+              <w:t>flow</w:t>
+            </w:r>
+            <w:proofErr w:type="spellEnd"/>
+            <w:r>
+              <w:rPr>
+                <w:b/>
+                <w:bCs/>
+                <w:sz w:val="18"/>
+                <w:szCs w:val="18"/>
+                <w:lang w:val="cs-CZ"/>
+              </w:rPr>
+              <w:t xml:space="preserve"> e-shopu</w:t>
+            </w:r>
+          </w:p>
+        </w:tc>
+        <w:tc>
+          <w:tcPr>
+            <w:tcW w:w="1605" w:type="dxa"/>
             <w:tcBorders>
               <w:top w:val="single" w:sz="1" w:space="0" w:color="2E75B6"/>
               <w:left w:val="single" w:sz="1" w:space="0" w:color="2E75B6"/>
@@ -330,20 +506,9 @@
               <w:right w:val="single" w:sz="1" w:space="0" w:color="2E75B6"/>
             </w:tcBorders>
             <w:shd w:val="clear" w:color="auto" w:fill="D5E8F0"/>
-            <w:tcMar>
-              <w:top w:w="80" w:type="dxa"/>
-              <w:left w:w="120" w:type="dxa"/>
-              <w:bottom w:w="80" w:type="dxa"/>
-              <w:right w:w="120" w:type="dxa"/>
-            </w:tcMar>
-          </w:tcPr>
-          <w:p>
-            <w:pPr>
-              <w:rPr>
-                <w:lang w:val="cs-CZ"/>
-              </w:rPr>
-            </w:pPr>
-            <w:r>
+          </w:tcPr>
+          <w:p>
+            <w:pPr>
               <w:rPr>
                 <w:b/>
                 <w:bCs/>
@@ -351,13 +516,22 @@
                 <w:szCs w:val="18"/>
                 <w:lang w:val="cs-CZ"/>
               </w:rPr>
-              <w:t>Odhad podílu u Alzy</w:t>
+            </w:pPr>
+            <w:r>
+              <w:rPr>
+                <w:b/>
+                <w:bCs/>
+                <w:sz w:val="18"/>
+                <w:szCs w:val="18"/>
+                <w:lang w:val="cs-CZ"/>
+              </w:rPr>
+              <w:t>Odhad podílu obratu u Alzy</w:t>
             </w:r>
           </w:p>
         </w:tc>
         <w:tc>
           <w:tcPr>
-            <w:tcW w:w="1600" w:type="dxa"/>
+            <w:tcW w:w="1605" w:type="dxa"/>
             <w:tcBorders>
               <w:top w:val="single" w:sz="1" w:space="0" w:color="2E75B6"/>
               <w:left w:val="single" w:sz="1" w:space="0" w:color="2E75B6"/>
@@ -365,20 +539,9 @@
               <w:right w:val="single" w:sz="1" w:space="0" w:color="2E75B6"/>
             </w:tcBorders>
             <w:shd w:val="clear" w:color="auto" w:fill="D5E8F0"/>
-            <w:tcMar>
-              <w:top w:w="80" w:type="dxa"/>
-              <w:left w:w="120" w:type="dxa"/>
-              <w:bottom w:w="80" w:type="dxa"/>
-              <w:right w:w="120" w:type="dxa"/>
-            </w:tcMar>
-          </w:tcPr>
-          <w:p>
-            <w:pPr>
-              <w:rPr>
-                <w:lang w:val="cs-CZ"/>
-              </w:rPr>
-            </w:pPr>
-            <w:r>
+          </w:tcPr>
+          <w:p>
+            <w:pPr>
               <w:rPr>
                 <w:b/>
                 <w:bCs/>
@@ -386,21 +549,24 @@
                 <w:szCs w:val="18"/>
                 <w:lang w:val="cs-CZ"/>
               </w:rPr>
-              <w:t>Odhad konverze</w:t>
+            </w:pPr>
+            <w:r>
+              <w:rPr>
+                <w:b/>
+                <w:bCs/>
+                <w:sz w:val="18"/>
+                <w:szCs w:val="18"/>
+                <w:lang w:val="cs-CZ"/>
+              </w:rPr>
+              <w:t>Odhad konverze u Alzy</w:t>
             </w:r>
           </w:p>
         </w:tc>
       </w:tr>
       <w:tr>
-        <w:tblPrEx>
-          <w:tblCellMar>
-            <w:top w:w="0" w:type="dxa"/>
-            <w:bottom w:w="0" w:type="dxa"/>
-          </w:tblCellMar>
-        </w:tblPrEx>
-        <w:tc>
-          <w:tcPr>
-            <w:tcW w:w="2200" w:type="dxa"/>
+        <w:tc>
+          <w:tcPr>
+            <w:tcW w:w="1784" w:type="dxa"/>
             <w:tcBorders>
               <w:top w:val="single" w:sz="1" w:space="0" w:color="CCCCCC"/>
               <w:left w:val="single" w:sz="1" w:space="0" w:color="CCCCCC"/>
@@ -427,13 +593,31 @@
                 <w:szCs w:val="18"/>
                 <w:lang w:val="cs-CZ"/>
               </w:rPr>
-              <w:t>Online platba kartou (vč. Apple/Google Pay)</w:t>
+              <w:t xml:space="preserve">Online platba kartou (vč. Apple/Google </w:t>
             </w:r>
-          </w:p>
-        </w:tc>
-        <w:tc>
-          <w:tcPr>
-            <w:tcW w:w="1400" w:type="dxa"/>
+            <w:proofErr w:type="spellStart"/>
+            <w:r>
+              <w:rPr>
+                <w:sz w:val="18"/>
+                <w:szCs w:val="18"/>
+                <w:lang w:val="cs-CZ"/>
+              </w:rPr>
+              <w:t>Pay</w:t>
+            </w:r>
+            <w:proofErr w:type="spellEnd"/>
+            <w:r>
+              <w:rPr>
+                <w:sz w:val="18"/>
+                <w:szCs w:val="18"/>
+                <w:lang w:val="cs-CZ"/>
+              </w:rPr>
+              <w:t>)</w:t>
+            </w:r>
+          </w:p>
+        </w:tc>
+        <w:tc>
+          <w:tcPr>
+            <w:tcW w:w="1132" w:type="dxa"/>
             <w:tcBorders>
               <w:top w:val="single" w:sz="1" w:space="0" w:color="CCCCCC"/>
               <w:left w:val="single" w:sz="1" w:space="0" w:color="CCCCCC"/>
@@ -466,7 +650,7 @@
         </w:tc>
         <w:tc>
           <w:tcPr>
-            <w:tcW w:w="1600" w:type="dxa"/>
+            <w:tcW w:w="1523" w:type="dxa"/>
             <w:tcBorders>
               <w:top w:val="single" w:sz="1" w:space="0" w:color="CCCCCC"/>
               <w:left w:val="single" w:sz="1" w:space="0" w:color="CCCCCC"/>
@@ -499,7 +683,7 @@
         </w:tc>
         <w:tc>
           <w:tcPr>
-            <w:tcW w:w="2200" w:type="dxa"/>
+            <w:tcW w:w="2095" w:type="dxa"/>
             <w:tcBorders>
               <w:top w:val="single" w:sz="1" w:space="0" w:color="CCCCCC"/>
               <w:left w:val="single" w:sz="1" w:space="0" w:color="CCCCCC"/>
@@ -532,7 +716,51 @@
         </w:tc>
         <w:tc>
           <w:tcPr>
-            <w:tcW w:w="1400" w:type="dxa"/>
+            <w:tcW w:w="1605" w:type="dxa"/>
+            <w:tcBorders>
+              <w:top w:val="single" w:sz="1" w:space="0" w:color="CCCCCC"/>
+              <w:left w:val="single" w:sz="1" w:space="0" w:color="CCCCCC"/>
+              <w:bottom w:val="single" w:sz="1" w:space="0" w:color="CCCCCC"/>
+              <w:right w:val="single" w:sz="1" w:space="0" w:color="CCCCCC"/>
+            </w:tcBorders>
+            <w:shd w:val="clear" w:color="auto" w:fill="FFFFFF"/>
+          </w:tcPr>
+          <w:p>
+            <w:pPr>
+              <w:rPr>
+                <w:sz w:val="18"/>
+                <w:szCs w:val="18"/>
+                <w:lang w:val="cs-CZ"/>
+              </w:rPr>
+            </w:pPr>
+          </w:p>
+        </w:tc>
+        <w:tc>
+          <w:tcPr>
+            <w:tcW w:w="1605" w:type="dxa"/>
+            <w:tcBorders>
+              <w:top w:val="single" w:sz="1" w:space="0" w:color="CCCCCC"/>
+              <w:left w:val="single" w:sz="1" w:space="0" w:color="CCCCCC"/>
+              <w:bottom w:val="single" w:sz="1" w:space="0" w:color="CCCCCC"/>
+              <w:right w:val="single" w:sz="1" w:space="0" w:color="CCCCCC"/>
+            </w:tcBorders>
+            <w:shd w:val="clear" w:color="auto" w:fill="FFFFFF"/>
+          </w:tcPr>
+          <w:p>
+            <w:pPr>
+              <w:rPr>
+                <w:sz w:val="18"/>
+                <w:szCs w:val="18"/>
+                <w:lang w:val="cs-CZ"/>
+              </w:rPr>
+            </w:pPr>
+          </w:p>
+        </w:tc>
+      </w:tr>
+      <w:tr>
+        <w:tc>
+          <w:tcPr>
+            <w:tcW w:w="1784" w:type="dxa"/>
             <w:tcBorders>
               <w:top w:val="single" w:sz="1" w:space="0" w:color="CCCCCC"/>
               <w:left w:val="single" w:sz="1" w:space="0" w:color="CCCCCC"/>
@@ -553,11 +781,19 @@
                 <w:lang w:val="cs-CZ"/>
               </w:rPr>
             </w:pPr>
-          </w:p>
-        </w:tc>
-        <w:tc>
-          <w:tcPr>
-            <w:tcW w:w="1600" w:type="dxa"/>
+            <w:r>
+              <w:rPr>
+                <w:sz w:val="18"/>
+                <w:szCs w:val="18"/>
+                <w:lang w:val="cs-CZ"/>
+              </w:rPr>
+              <w:t>Rychlý bankovní převod / QR platba</w:t>
+            </w:r>
+          </w:p>
+        </w:tc>
+        <w:tc>
+          <w:tcPr>
+            <w:tcW w:w="1132" w:type="dxa"/>
             <w:tcBorders>
               <w:top w:val="single" w:sz="1" w:space="0" w:color="CCCCCC"/>
               <w:left w:val="single" w:sz="1" w:space="0" w:color="CCCCCC"/>
@@ -578,19 +814,19 @@
                 <w:lang w:val="cs-CZ"/>
               </w:rPr>
             </w:pPr>
-          </w:p>
-        </w:tc>
-      </w:tr>
-      <w:tr>
-        <w:tblPrEx>
-          <w:tblCellMar>
-            <w:top w:w="0" w:type="dxa"/>
-            <w:bottom w:w="0" w:type="dxa"/>
-          </w:tblCellMar>
-        </w:tblPrEx>
-        <w:tc>
-          <w:tcPr>
-            <w:tcW w:w="2200" w:type="dxa"/>
+            <w:r>
+              <w:rPr>
+                <w:sz w:val="18"/>
+                <w:szCs w:val="18"/>
+                <w:lang w:val="cs-CZ"/>
+              </w:rPr>
+              <w:t>~10–20 %</w:t>
+            </w:r>
+          </w:p>
+        </w:tc>
+        <w:tc>
+          <w:tcPr>
+            <w:tcW w:w="1523" w:type="dxa"/>
             <w:tcBorders>
               <w:top w:val="single" w:sz="1" w:space="0" w:color="CCCCCC"/>
               <w:left w:val="single" w:sz="1" w:space="0" w:color="CCCCCC"/>
@@ -617,13 +853,13 @@
                 <w:szCs w:val="18"/>
                 <w:lang w:val="cs-CZ"/>
               </w:rPr>
-              <w:t>Rychlý bankovní převod / QR platba</w:t>
+              <w:t>Střední</w:t>
             </w:r>
           </w:p>
         </w:tc>
         <w:tc>
           <w:tcPr>
-            <w:tcW w:w="1400" w:type="dxa"/>
+            <w:tcW w:w="2095" w:type="dxa"/>
             <w:tcBorders>
               <w:top w:val="single" w:sz="1" w:space="0" w:color="CCCCCC"/>
               <w:left w:val="single" w:sz="1" w:space="0" w:color="CCCCCC"/>
@@ -650,13 +886,57 @@
                 <w:szCs w:val="18"/>
                 <w:lang w:val="cs-CZ"/>
               </w:rPr>
-              <w:t>~10–20 %</w:t>
+              <w:t>Nižší poplatky, ale riziko neprovedení platby.</w:t>
             </w:r>
           </w:p>
         </w:tc>
         <w:tc>
           <w:tcPr>
-            <w:tcW w:w="1600" w:type="dxa"/>
+            <w:tcW w:w="1605" w:type="dxa"/>
+            <w:tcBorders>
+              <w:top w:val="single" w:sz="1" w:space="0" w:color="CCCCCC"/>
+              <w:left w:val="single" w:sz="1" w:space="0" w:color="CCCCCC"/>
+              <w:bottom w:val="single" w:sz="1" w:space="0" w:color="CCCCCC"/>
+              <w:right w:val="single" w:sz="1" w:space="0" w:color="CCCCCC"/>
+            </w:tcBorders>
+            <w:shd w:val="clear" w:color="auto" w:fill="FFFFFF"/>
+          </w:tcPr>
+          <w:p>
+            <w:pPr>
+              <w:rPr>
+                <w:sz w:val="18"/>
+                <w:szCs w:val="18"/>
+                <w:lang w:val="cs-CZ"/>
+              </w:rPr>
+            </w:pPr>
+          </w:p>
+        </w:tc>
+        <w:tc>
+          <w:tcPr>
+            <w:tcW w:w="1605" w:type="dxa"/>
+            <w:tcBorders>
+              <w:top w:val="single" w:sz="1" w:space="0" w:color="CCCCCC"/>
+              <w:left w:val="single" w:sz="1" w:space="0" w:color="CCCCCC"/>
+              <w:bottom w:val="single" w:sz="1" w:space="0" w:color="CCCCCC"/>
+              <w:right w:val="single" w:sz="1" w:space="0" w:color="CCCCCC"/>
+            </w:tcBorders>
+            <w:shd w:val="clear" w:color="auto" w:fill="FFFFFF"/>
+          </w:tcPr>
+          <w:p>
+            <w:pPr>
+              <w:rPr>
+                <w:sz w:val="18"/>
+                <w:szCs w:val="18"/>
+                <w:lang w:val="cs-CZ"/>
+              </w:rPr>
+            </w:pPr>
+          </w:p>
+        </w:tc>
+      </w:tr>
+      <w:tr>
+        <w:tc>
+          <w:tcPr>
+            <w:tcW w:w="1784" w:type="dxa"/>
             <w:tcBorders>
               <w:top w:val="single" w:sz="1" w:space="0" w:color="CCCCCC"/>
               <w:left w:val="single" w:sz="1" w:space="0" w:color="CCCCCC"/>
@@ -683,13 +963,13 @@
                 <w:szCs w:val="18"/>
                 <w:lang w:val="cs-CZ"/>
               </w:rPr>
-              <w:t>Střední</w:t>
+              <w:t>Dobírka (platba při převzetí)</w:t>
             </w:r>
           </w:p>
         </w:tc>
         <w:tc>
           <w:tcPr>
-            <w:tcW w:w="2200" w:type="dxa"/>
+            <w:tcW w:w="1132" w:type="dxa"/>
             <w:tcBorders>
               <w:top w:val="single" w:sz="1" w:space="0" w:color="CCCCCC"/>
               <w:left w:val="single" w:sz="1" w:space="0" w:color="CCCCCC"/>
@@ -716,13 +996,13 @@
                 <w:szCs w:val="18"/>
                 <w:lang w:val="cs-CZ"/>
               </w:rPr>
-              <w:t>Nižší poplatky, ale riziko neprovedení platby.</w:t>
+              <w:t>~5–15 %</w:t>
             </w:r>
           </w:p>
         </w:tc>
         <w:tc>
           <w:tcPr>
-            <w:tcW w:w="1400" w:type="dxa"/>
+            <w:tcW w:w="1523" w:type="dxa"/>
             <w:tcBorders>
               <w:top w:val="single" w:sz="1" w:space="0" w:color="CCCCCC"/>
               <w:left w:val="single" w:sz="1" w:space="0" w:color="CCCCCC"/>
@@ -743,11 +1023,19 @@
                 <w:lang w:val="cs-CZ"/>
               </w:rPr>
             </w:pPr>
-          </w:p>
-        </w:tc>
-        <w:tc>
-          <w:tcPr>
-            <w:tcW w:w="1600" w:type="dxa"/>
+            <w:r>
+              <w:rPr>
+                <w:sz w:val="18"/>
+                <w:szCs w:val="18"/>
+                <w:lang w:val="cs-CZ"/>
+              </w:rPr>
+              <w:t>Vysoká (pokud vyzvednou)</w:t>
+            </w:r>
+          </w:p>
+        </w:tc>
+        <w:tc>
+          <w:tcPr>
+            <w:tcW w:w="2095" w:type="dxa"/>
             <w:tcBorders>
               <w:top w:val="single" w:sz="1" w:space="0" w:color="CCCCCC"/>
               <w:left w:val="single" w:sz="1" w:space="0" w:color="CCCCCC"/>
@@ -768,19 +1056,81 @@
                 <w:lang w:val="cs-CZ"/>
               </w:rPr>
             </w:pPr>
+            <w:r>
+              <w:rPr>
+                <w:sz w:val="18"/>
+                <w:szCs w:val="18"/>
+                <w:lang w:val="cs-CZ"/>
+              </w:rPr>
+              <w:t xml:space="preserve">Peníze později, vyšší logistické náklady a </w:t>
+            </w:r>
+            <w:proofErr w:type="spellStart"/>
+            <w:r>
+              <w:rPr>
+                <w:sz w:val="18"/>
+                <w:szCs w:val="18"/>
+                <w:lang w:val="cs-CZ"/>
+              </w:rPr>
+              <w:t>vratkovost</w:t>
+            </w:r>
+            <w:proofErr w:type="spellEnd"/>
+            <w:r>
+              <w:rPr>
+                <w:sz w:val="18"/>
+                <w:szCs w:val="18"/>
+                <w:lang w:val="cs-CZ"/>
+              </w:rPr>
+              <w:t>.</w:t>
+            </w:r>
+          </w:p>
+        </w:tc>
+        <w:tc>
+          <w:tcPr>
+            <w:tcW w:w="1605" w:type="dxa"/>
+            <w:tcBorders>
+              <w:top w:val="single" w:sz="1" w:space="0" w:color="CCCCCC"/>
+              <w:left w:val="single" w:sz="1" w:space="0" w:color="CCCCCC"/>
+              <w:bottom w:val="single" w:sz="1" w:space="0" w:color="CCCCCC"/>
+              <w:right w:val="single" w:sz="1" w:space="0" w:color="CCCCCC"/>
+            </w:tcBorders>
+            <w:shd w:val="clear" w:color="auto" w:fill="FFFFFF"/>
+          </w:tcPr>
+          <w:p>
+            <w:pPr>
+              <w:rPr>
+                <w:sz w:val="18"/>
+                <w:szCs w:val="18"/>
+                <w:lang w:val="cs-CZ"/>
+              </w:rPr>
+            </w:pPr>
+          </w:p>
+        </w:tc>
+        <w:tc>
+          <w:tcPr>
+            <w:tcW w:w="1605" w:type="dxa"/>
+            <w:tcBorders>
+              <w:top w:val="single" w:sz="1" w:space="0" w:color="CCCCCC"/>
+              <w:left w:val="single" w:sz="1" w:space="0" w:color="CCCCCC"/>
+              <w:bottom w:val="single" w:sz="1" w:space="0" w:color="CCCCCC"/>
+              <w:right w:val="single" w:sz="1" w:space="0" w:color="CCCCCC"/>
+            </w:tcBorders>
+            <w:shd w:val="clear" w:color="auto" w:fill="FFFFFF"/>
+          </w:tcPr>
+          <w:p>
+            <w:pPr>
+              <w:rPr>
+                <w:sz w:val="18"/>
+                <w:szCs w:val="18"/>
+                <w:lang w:val="cs-CZ"/>
+              </w:rPr>
+            </w:pPr>
           </w:p>
         </w:tc>
       </w:tr>
       <w:tr>
-        <w:tblPrEx>
-          <w:tblCellMar>
-            <w:top w:w="0" w:type="dxa"/>
-            <w:bottom w:w="0" w:type="dxa"/>
-          </w:tblCellMar>
-        </w:tblPrEx>
-        <w:tc>
-          <w:tcPr>
-            <w:tcW w:w="2200" w:type="dxa"/>
+        <w:tc>
+          <w:tcPr>
+            <w:tcW w:w="1784" w:type="dxa"/>
             <w:tcBorders>
               <w:top w:val="single" w:sz="1" w:space="0" w:color="CCCCCC"/>
               <w:left w:val="single" w:sz="1" w:space="0" w:color="CCCCCC"/>
@@ -807,13 +1157,13 @@
                 <w:szCs w:val="18"/>
                 <w:lang w:val="cs-CZ"/>
               </w:rPr>
-              <w:t>Dobírka (platba při převzetí)</w:t>
+              <w:t>BNPL / odložená platba</w:t>
             </w:r>
           </w:p>
         </w:tc>
         <w:tc>
           <w:tcPr>
-            <w:tcW w:w="1400" w:type="dxa"/>
+            <w:tcW w:w="1132" w:type="dxa"/>
             <w:tcBorders>
               <w:top w:val="single" w:sz="1" w:space="0" w:color="CCCCCC"/>
               <w:left w:val="single" w:sz="1" w:space="0" w:color="CCCCCC"/>
@@ -840,13 +1190,13 @@
                 <w:szCs w:val="18"/>
                 <w:lang w:val="cs-CZ"/>
               </w:rPr>
-              <w:t>~5–15 %</w:t>
+              <w:t>~3–7 %</w:t>
             </w:r>
           </w:p>
         </w:tc>
         <w:tc>
           <w:tcPr>
-            <w:tcW w:w="1600" w:type="dxa"/>
+            <w:tcW w:w="1523" w:type="dxa"/>
             <w:tcBorders>
               <w:top w:val="single" w:sz="1" w:space="0" w:color="CCCCCC"/>
               <w:left w:val="single" w:sz="1" w:space="0" w:color="CCCCCC"/>
@@ -873,13 +1223,13 @@
                 <w:szCs w:val="18"/>
                 <w:lang w:val="cs-CZ"/>
               </w:rPr>
-              <w:t>Vysoká (pokud vyzvednou)</w:t>
+              <w:t>Vysoká</w:t>
             </w:r>
           </w:p>
         </w:tc>
         <w:tc>
           <w:tcPr>
-            <w:tcW w:w="2200" w:type="dxa"/>
+            <w:tcW w:w="2095" w:type="dxa"/>
             <w:tcBorders>
               <w:top w:val="single" w:sz="1" w:space="0" w:color="CCCCCC"/>
               <w:left w:val="single" w:sz="1" w:space="0" w:color="CCCCCC"/>
@@ -906,13 +1256,57 @@
                 <w:szCs w:val="18"/>
                 <w:lang w:val="cs-CZ"/>
               </w:rPr>
-              <w:t>Peníze později, vyšší logistické náklady a vratkovost.</w:t>
+              <w:t>Rychlá úhrada pro e-shop, vyšší provize poskytovateli.</w:t>
             </w:r>
           </w:p>
         </w:tc>
         <w:tc>
           <w:tcPr>
-            <w:tcW w:w="1400" w:type="dxa"/>
+            <w:tcW w:w="1605" w:type="dxa"/>
+            <w:tcBorders>
+              <w:top w:val="single" w:sz="1" w:space="0" w:color="CCCCCC"/>
+              <w:left w:val="single" w:sz="1" w:space="0" w:color="CCCCCC"/>
+              <w:bottom w:val="single" w:sz="1" w:space="0" w:color="CCCCCC"/>
+              <w:right w:val="single" w:sz="1" w:space="0" w:color="CCCCCC"/>
+            </w:tcBorders>
+            <w:shd w:val="clear" w:color="auto" w:fill="FFFFFF"/>
+          </w:tcPr>
+          <w:p>
+            <w:pPr>
+              <w:rPr>
+                <w:sz w:val="18"/>
+                <w:szCs w:val="18"/>
+                <w:lang w:val="cs-CZ"/>
+              </w:rPr>
+            </w:pPr>
+          </w:p>
+        </w:tc>
+        <w:tc>
+          <w:tcPr>
+            <w:tcW w:w="1605" w:type="dxa"/>
+            <w:tcBorders>
+              <w:top w:val="single" w:sz="1" w:space="0" w:color="CCCCCC"/>
+              <w:left w:val="single" w:sz="1" w:space="0" w:color="CCCCCC"/>
+              <w:bottom w:val="single" w:sz="1" w:space="0" w:color="CCCCCC"/>
+              <w:right w:val="single" w:sz="1" w:space="0" w:color="CCCCCC"/>
+            </w:tcBorders>
+            <w:shd w:val="clear" w:color="auto" w:fill="FFFFFF"/>
+          </w:tcPr>
+          <w:p>
+            <w:pPr>
+              <w:rPr>
+                <w:sz w:val="18"/>
+                <w:szCs w:val="18"/>
+                <w:lang w:val="cs-CZ"/>
+              </w:rPr>
+            </w:pPr>
+          </w:p>
+        </w:tc>
+      </w:tr>
+      <w:tr>
+        <w:tc>
+          <w:tcPr>
+            <w:tcW w:w="1784" w:type="dxa"/>
             <w:tcBorders>
               <w:top w:val="single" w:sz="1" w:space="0" w:color="CCCCCC"/>
               <w:left w:val="single" w:sz="1" w:space="0" w:color="CCCCCC"/>
@@ -933,11 +1327,19 @@
                 <w:lang w:val="cs-CZ"/>
               </w:rPr>
             </w:pPr>
-          </w:p>
-        </w:tc>
-        <w:tc>
-          <w:tcPr>
-            <w:tcW w:w="1600" w:type="dxa"/>
+            <w:r>
+              <w:rPr>
+                <w:sz w:val="18"/>
+                <w:szCs w:val="18"/>
+                <w:lang w:val="cs-CZ"/>
+              </w:rPr>
+              <w:t>Hotovost / karta na prodejně</w:t>
+            </w:r>
+          </w:p>
+        </w:tc>
+        <w:tc>
+          <w:tcPr>
+            <w:tcW w:w="1132" w:type="dxa"/>
             <w:tcBorders>
               <w:top w:val="single" w:sz="1" w:space="0" w:color="CCCCCC"/>
               <w:left w:val="single" w:sz="1" w:space="0" w:color="CCCCCC"/>
@@ -958,19 +1360,19 @@
                 <w:lang w:val="cs-CZ"/>
               </w:rPr>
             </w:pPr>
-          </w:p>
-        </w:tc>
-      </w:tr>
-      <w:tr>
-        <w:tblPrEx>
-          <w:tblCellMar>
-            <w:top w:w="0" w:type="dxa"/>
-            <w:bottom w:w="0" w:type="dxa"/>
-          </w:tblCellMar>
-        </w:tblPrEx>
-        <w:tc>
-          <w:tcPr>
-            <w:tcW w:w="2200" w:type="dxa"/>
+            <w:r>
+              <w:rPr>
+                <w:sz w:val="18"/>
+                <w:szCs w:val="18"/>
+                <w:lang w:val="cs-CZ"/>
+              </w:rPr>
+              <w:t>Malý podíl</w:t>
+            </w:r>
+          </w:p>
+        </w:tc>
+        <w:tc>
+          <w:tcPr>
+            <w:tcW w:w="1523" w:type="dxa"/>
             <w:tcBorders>
               <w:top w:val="single" w:sz="1" w:space="0" w:color="CCCCCC"/>
               <w:left w:val="single" w:sz="1" w:space="0" w:color="CCCCCC"/>
@@ -997,13 +1399,13 @@
                 <w:szCs w:val="18"/>
                 <w:lang w:val="cs-CZ"/>
               </w:rPr>
-              <w:t>BNPL / odložená platba</w:t>
+              <w:t>Vysoká</w:t>
             </w:r>
           </w:p>
         </w:tc>
         <w:tc>
           <w:tcPr>
-            <w:tcW w:w="1400" w:type="dxa"/>
+            <w:tcW w:w="2095" w:type="dxa"/>
             <w:tcBorders>
               <w:top w:val="single" w:sz="1" w:space="0" w:color="CCCCCC"/>
               <w:left w:val="single" w:sz="1" w:space="0" w:color="CCCCCC"/>
@@ -1030,13 +1432,57 @@
                 <w:szCs w:val="18"/>
                 <w:lang w:val="cs-CZ"/>
               </w:rPr>
-              <w:t>~3–7 %</w:t>
+              <w:t>Okamžitá úhrada, nutnost práce s hotovostí.</w:t>
             </w:r>
           </w:p>
         </w:tc>
         <w:tc>
           <w:tcPr>
-            <w:tcW w:w="1600" w:type="dxa"/>
+            <w:tcW w:w="1605" w:type="dxa"/>
+            <w:tcBorders>
+              <w:top w:val="single" w:sz="1" w:space="0" w:color="CCCCCC"/>
+              <w:left w:val="single" w:sz="1" w:space="0" w:color="CCCCCC"/>
+              <w:bottom w:val="single" w:sz="1" w:space="0" w:color="CCCCCC"/>
+              <w:right w:val="single" w:sz="1" w:space="0" w:color="CCCCCC"/>
+            </w:tcBorders>
+            <w:shd w:val="clear" w:color="auto" w:fill="FFFFFF"/>
+          </w:tcPr>
+          <w:p>
+            <w:pPr>
+              <w:rPr>
+                <w:sz w:val="18"/>
+                <w:szCs w:val="18"/>
+                <w:lang w:val="cs-CZ"/>
+              </w:rPr>
+            </w:pPr>
+          </w:p>
+        </w:tc>
+        <w:tc>
+          <w:tcPr>
+            <w:tcW w:w="1605" w:type="dxa"/>
+            <w:tcBorders>
+              <w:top w:val="single" w:sz="1" w:space="0" w:color="CCCCCC"/>
+              <w:left w:val="single" w:sz="1" w:space="0" w:color="CCCCCC"/>
+              <w:bottom w:val="single" w:sz="1" w:space="0" w:color="CCCCCC"/>
+              <w:right w:val="single" w:sz="1" w:space="0" w:color="CCCCCC"/>
+            </w:tcBorders>
+            <w:shd w:val="clear" w:color="auto" w:fill="FFFFFF"/>
+          </w:tcPr>
+          <w:p>
+            <w:pPr>
+              <w:rPr>
+                <w:sz w:val="18"/>
+                <w:szCs w:val="18"/>
+                <w:lang w:val="cs-CZ"/>
+              </w:rPr>
+            </w:pPr>
+          </w:p>
+        </w:tc>
+      </w:tr>
+      <w:tr>
+        <w:tc>
+          <w:tcPr>
+            <w:tcW w:w="1784" w:type="dxa"/>
             <w:tcBorders>
               <w:top w:val="single" w:sz="1" w:space="0" w:color="CCCCCC"/>
               <w:left w:val="single" w:sz="1" w:space="0" w:color="CCCCCC"/>
@@ -1063,13 +1509,13 @@
                 <w:szCs w:val="18"/>
                 <w:lang w:val="cs-CZ"/>
               </w:rPr>
-              <w:t>Vysoká</w:t>
+              <w:t>Faktura / bankovní převod (B2B)</w:t>
             </w:r>
           </w:p>
         </w:tc>
         <w:tc>
           <w:tcPr>
-            <w:tcW w:w="2200" w:type="dxa"/>
+            <w:tcW w:w="1132" w:type="dxa"/>
             <w:tcBorders>
               <w:top w:val="single" w:sz="1" w:space="0" w:color="CCCCCC"/>
               <w:left w:val="single" w:sz="1" w:space="0" w:color="CCCCCC"/>
@@ -1096,13 +1542,13 @@
                 <w:szCs w:val="18"/>
                 <w:lang w:val="cs-CZ"/>
               </w:rPr>
-              <w:t>Rychlá úhrada pro e-shop, vyšší provize poskytovateli.</w:t>
+              <w:t>Většina B2B objemu</w:t>
             </w:r>
           </w:p>
         </w:tc>
         <w:tc>
           <w:tcPr>
-            <w:tcW w:w="1400" w:type="dxa"/>
+            <w:tcW w:w="1523" w:type="dxa"/>
             <w:tcBorders>
               <w:top w:val="single" w:sz="1" w:space="0" w:color="CCCCCC"/>
               <w:left w:val="single" w:sz="1" w:space="0" w:color="CCCCCC"/>
@@ -1123,11 +1569,19 @@
                 <w:lang w:val="cs-CZ"/>
               </w:rPr>
             </w:pPr>
-          </w:p>
-        </w:tc>
-        <w:tc>
-          <w:tcPr>
-            <w:tcW w:w="1600" w:type="dxa"/>
+            <w:r>
+              <w:rPr>
+                <w:sz w:val="18"/>
+                <w:szCs w:val="18"/>
+                <w:lang w:val="cs-CZ"/>
+              </w:rPr>
+              <w:t>Vysoká</w:t>
+            </w:r>
+          </w:p>
+        </w:tc>
+        <w:tc>
+          <w:tcPr>
+            <w:tcW w:w="2095" w:type="dxa"/>
             <w:tcBorders>
               <w:top w:val="single" w:sz="1" w:space="0" w:color="CCCCCC"/>
               <w:left w:val="single" w:sz="1" w:space="0" w:color="CCCCCC"/>
@@ -1148,19 +1602,19 @@
                 <w:lang w:val="cs-CZ"/>
               </w:rPr>
             </w:pPr>
-          </w:p>
-        </w:tc>
-      </w:tr>
-      <w:tr>
-        <w:tblPrEx>
-          <w:tblCellMar>
-            <w:top w:w="0" w:type="dxa"/>
-            <w:bottom w:w="0" w:type="dxa"/>
-          </w:tblCellMar>
-        </w:tblPrEx>
-        <w:tc>
-          <w:tcPr>
-            <w:tcW w:w="2200" w:type="dxa"/>
+            <w:r>
+              <w:rPr>
+                <w:sz w:val="18"/>
+                <w:szCs w:val="18"/>
+                <w:lang w:val="cs-CZ"/>
+              </w:rPr>
+              <w:t>Bez poplatků, ale dlouhá splatnost a kreditní riziko.</w:t>
+            </w:r>
+          </w:p>
+        </w:tc>
+        <w:tc>
+          <w:tcPr>
+            <w:tcW w:w="1605" w:type="dxa"/>
             <w:tcBorders>
               <w:top w:val="single" w:sz="1" w:space="0" w:color="CCCCCC"/>
               <w:left w:val="single" w:sz="1" w:space="0" w:color="CCCCCC"/>
@@ -1168,32 +1622,20 @@
               <w:right w:val="single" w:sz="1" w:space="0" w:color="CCCCCC"/>
             </w:tcBorders>
             <w:shd w:val="clear" w:color="auto" w:fill="FFFFFF"/>
-            <w:tcMar>
-              <w:top w:w="80" w:type="dxa"/>
-              <w:left w:w="120" w:type="dxa"/>
-              <w:bottom w:w="80" w:type="dxa"/>
-              <w:right w:w="120" w:type="dxa"/>
-            </w:tcMar>
-          </w:tcPr>
-          <w:p>
-            <w:pPr>
-              <w:rPr>
-                <w:lang w:val="cs-CZ"/>
-              </w:rPr>
-            </w:pPr>
-            <w:r>
-              <w:rPr>
-                <w:sz w:val="18"/>
-                <w:szCs w:val="18"/>
-                <w:lang w:val="cs-CZ"/>
-              </w:rPr>
-              <w:t>Hotovost / karta na prodejně</w:t>
-            </w:r>
-          </w:p>
-        </w:tc>
-        <w:tc>
-          <w:tcPr>
-            <w:tcW w:w="1400" w:type="dxa"/>
+          </w:tcPr>
+          <w:p>
+            <w:pPr>
+              <w:rPr>
+                <w:sz w:val="18"/>
+                <w:szCs w:val="18"/>
+                <w:lang w:val="cs-CZ"/>
+              </w:rPr>
+            </w:pPr>
+          </w:p>
+        </w:tc>
+        <w:tc>
+          <w:tcPr>
+            <w:tcW w:w="1605" w:type="dxa"/>
             <w:tcBorders>
               <w:top w:val="single" w:sz="1" w:space="0" w:color="CCCCCC"/>
               <w:left w:val="single" w:sz="1" w:space="0" w:color="CCCCCC"/>
@@ -1201,330 +1643,12 @@
               <w:right w:val="single" w:sz="1" w:space="0" w:color="CCCCCC"/>
             </w:tcBorders>
             <w:shd w:val="clear" w:color="auto" w:fill="FFFFFF"/>
-            <w:tcMar>
-              <w:top w:w="80" w:type="dxa"/>
-              <w:left w:w="120" w:type="dxa"/>
-              <w:bottom w:w="80" w:type="dxa"/>
-              <w:right w:w="120" w:type="dxa"/>
-            </w:tcMar>
-          </w:tcPr>
-          <w:p>
-            <w:pPr>
-              <w:rPr>
-                <w:lang w:val="cs-CZ"/>
-              </w:rPr>
-            </w:pPr>
-            <w:r>
-              <w:rPr>
-                <w:sz w:val="18"/>
-                <w:szCs w:val="18"/>
-                <w:lang w:val="cs-CZ"/>
-              </w:rPr>
-              <w:t>Malý podíl</w:t>
-            </w:r>
-          </w:p>
-        </w:tc>
-        <w:tc>
-          <w:tcPr>
-            <w:tcW w:w="1600" w:type="dxa"/>
-            <w:tcBorders>
-              <w:top w:val="single" w:sz="1" w:space="0" w:color="CCCCCC"/>
-              <w:left w:val="single" w:sz="1" w:space="0" w:color="CCCCCC"/>
-              <w:bottom w:val="single" w:sz="1" w:space="0" w:color="CCCCCC"/>
-              <w:right w:val="single" w:sz="1" w:space="0" w:color="CCCCCC"/>
-            </w:tcBorders>
-            <w:shd w:val="clear" w:color="auto" w:fill="FFFFFF"/>
-            <w:tcMar>
-              <w:top w:w="80" w:type="dxa"/>
-              <w:left w:w="120" w:type="dxa"/>
-              <w:bottom w:w="80" w:type="dxa"/>
-              <w:right w:w="120" w:type="dxa"/>
-            </w:tcMar>
-          </w:tcPr>
-          <w:p>
-            <w:pPr>
-              <w:rPr>
-                <w:lang w:val="cs-CZ"/>
-              </w:rPr>
-            </w:pPr>
-            <w:r>
-              <w:rPr>
-                <w:sz w:val="18"/>
-                <w:szCs w:val="18"/>
-                <w:lang w:val="cs-CZ"/>
-              </w:rPr>
-              <w:t>Vysoká</w:t>
-            </w:r>
-          </w:p>
-        </w:tc>
-        <w:tc>
-          <w:tcPr>
-            <w:tcW w:w="2200" w:type="dxa"/>
-            <w:tcBorders>
-              <w:top w:val="single" w:sz="1" w:space="0" w:color="CCCCCC"/>
-              <w:left w:val="single" w:sz="1" w:space="0" w:color="CCCCCC"/>
-              <w:bottom w:val="single" w:sz="1" w:space="0" w:color="CCCCCC"/>
-              <w:right w:val="single" w:sz="1" w:space="0" w:color="CCCCCC"/>
-            </w:tcBorders>
-            <w:shd w:val="clear" w:color="auto" w:fill="FFFFFF"/>
-            <w:tcMar>
-              <w:top w:w="80" w:type="dxa"/>
-              <w:left w:w="120" w:type="dxa"/>
-              <w:bottom w:w="80" w:type="dxa"/>
-              <w:right w:w="120" w:type="dxa"/>
-            </w:tcMar>
-          </w:tcPr>
-          <w:p>
-            <w:pPr>
-              <w:rPr>
-                <w:lang w:val="cs-CZ"/>
-              </w:rPr>
-            </w:pPr>
-            <w:r>
-              <w:rPr>
-                <w:sz w:val="18"/>
-                <w:szCs w:val="18"/>
-                <w:lang w:val="cs-CZ"/>
-              </w:rPr>
-              <w:t>Okamžitá úhrada, nutnost práce s hotovostí.</w:t>
-            </w:r>
-          </w:p>
-        </w:tc>
-        <w:tc>
-          <w:tcPr>
-            <w:tcW w:w="1400" w:type="dxa"/>
-            <w:tcBorders>
-              <w:top w:val="single" w:sz="1" w:space="0" w:color="CCCCCC"/>
-              <w:left w:val="single" w:sz="1" w:space="0" w:color="CCCCCC"/>
-              <w:bottom w:val="single" w:sz="1" w:space="0" w:color="CCCCCC"/>
-              <w:right w:val="single" w:sz="1" w:space="0" w:color="CCCCCC"/>
-            </w:tcBorders>
-            <w:shd w:val="clear" w:color="auto" w:fill="FFFFFF"/>
-            <w:tcMar>
-              <w:top w:w="80" w:type="dxa"/>
-              <w:left w:w="120" w:type="dxa"/>
-              <w:bottom w:w="80" w:type="dxa"/>
-              <w:right w:w="120" w:type="dxa"/>
-            </w:tcMar>
-          </w:tcPr>
-          <w:p>
-            <w:pPr>
-              <w:rPr>
-                <w:lang w:val="cs-CZ"/>
-              </w:rPr>
-            </w:pPr>
-          </w:p>
-        </w:tc>
-        <w:tc>
-          <w:tcPr>
-            <w:tcW w:w="1600" w:type="dxa"/>
-            <w:tcBorders>
-              <w:top w:val="single" w:sz="1" w:space="0" w:color="CCCCCC"/>
-              <w:left w:val="single" w:sz="1" w:space="0" w:color="CCCCCC"/>
-              <w:bottom w:val="single" w:sz="1" w:space="0" w:color="CCCCCC"/>
-              <w:right w:val="single" w:sz="1" w:space="0" w:color="CCCCCC"/>
-            </w:tcBorders>
-            <w:shd w:val="clear" w:color="auto" w:fill="FFFFFF"/>
-            <w:tcMar>
-              <w:top w:w="80" w:type="dxa"/>
-              <w:left w:w="120" w:type="dxa"/>
-              <w:bottom w:w="80" w:type="dxa"/>
-              <w:right w:w="120" w:type="dxa"/>
-            </w:tcMar>
-          </w:tcPr>
-          <w:p>
-            <w:pPr>
-              <w:rPr>
-                <w:lang w:val="cs-CZ"/>
-              </w:rPr>
-            </w:pPr>
-          </w:p>
-        </w:tc>
-      </w:tr>
-      <w:tr>
-        <w:tblPrEx>
-          <w:tblCellMar>
-            <w:top w:w="0" w:type="dxa"/>
-            <w:bottom w:w="0" w:type="dxa"/>
-          </w:tblCellMar>
-        </w:tblPrEx>
-        <w:tc>
-          <w:tcPr>
-            <w:tcW w:w="2200" w:type="dxa"/>
-            <w:tcBorders>
-              <w:top w:val="single" w:sz="1" w:space="0" w:color="CCCCCC"/>
-              <w:left w:val="single" w:sz="1" w:space="0" w:color="CCCCCC"/>
-              <w:bottom w:val="single" w:sz="1" w:space="0" w:color="CCCCCC"/>
-              <w:right w:val="single" w:sz="1" w:space="0" w:color="CCCCCC"/>
-            </w:tcBorders>
-            <w:shd w:val="clear" w:color="auto" w:fill="FFFFFF"/>
-            <w:tcMar>
-              <w:top w:w="80" w:type="dxa"/>
-              <w:left w:w="120" w:type="dxa"/>
-              <w:bottom w:w="80" w:type="dxa"/>
-              <w:right w:w="120" w:type="dxa"/>
-            </w:tcMar>
-          </w:tcPr>
-          <w:p>
-            <w:pPr>
-              <w:rPr>
-                <w:lang w:val="cs-CZ"/>
-              </w:rPr>
-            </w:pPr>
-            <w:r>
-              <w:rPr>
-                <w:sz w:val="18"/>
-                <w:szCs w:val="18"/>
-                <w:lang w:val="cs-CZ"/>
-              </w:rPr>
-              <w:t>Faktura / bankovní převod (B2B)</w:t>
-            </w:r>
-          </w:p>
-        </w:tc>
-        <w:tc>
-          <w:tcPr>
-            <w:tcW w:w="1400" w:type="dxa"/>
-            <w:tcBorders>
-              <w:top w:val="single" w:sz="1" w:space="0" w:color="CCCCCC"/>
-              <w:left w:val="single" w:sz="1" w:space="0" w:color="CCCCCC"/>
-              <w:bottom w:val="single" w:sz="1" w:space="0" w:color="CCCCCC"/>
-              <w:right w:val="single" w:sz="1" w:space="0" w:color="CCCCCC"/>
-            </w:tcBorders>
-            <w:shd w:val="clear" w:color="auto" w:fill="FFFFFF"/>
-            <w:tcMar>
-              <w:top w:w="80" w:type="dxa"/>
-              <w:left w:w="120" w:type="dxa"/>
-              <w:bottom w:w="80" w:type="dxa"/>
-              <w:right w:w="120" w:type="dxa"/>
-            </w:tcMar>
-          </w:tcPr>
-          <w:p>
-            <w:pPr>
-              <w:rPr>
-                <w:lang w:val="cs-CZ"/>
-              </w:rPr>
-            </w:pPr>
-            <w:r>
-              <w:rPr>
-                <w:sz w:val="18"/>
-                <w:szCs w:val="18"/>
-                <w:lang w:val="cs-CZ"/>
-              </w:rPr>
-              <w:t>Většina B2B objemu</w:t>
-            </w:r>
-          </w:p>
-        </w:tc>
-        <w:tc>
-          <w:tcPr>
-            <w:tcW w:w="1600" w:type="dxa"/>
-            <w:tcBorders>
-              <w:top w:val="single" w:sz="1" w:space="0" w:color="CCCCCC"/>
-              <w:left w:val="single" w:sz="1" w:space="0" w:color="CCCCCC"/>
-              <w:bottom w:val="single" w:sz="1" w:space="0" w:color="CCCCCC"/>
-              <w:right w:val="single" w:sz="1" w:space="0" w:color="CCCCCC"/>
-            </w:tcBorders>
-            <w:shd w:val="clear" w:color="auto" w:fill="FFFFFF"/>
-            <w:tcMar>
-              <w:top w:w="80" w:type="dxa"/>
-              <w:left w:w="120" w:type="dxa"/>
-              <w:bottom w:w="80" w:type="dxa"/>
-              <w:right w:w="120" w:type="dxa"/>
-            </w:tcMar>
-          </w:tcPr>
-          <w:p>
-            <w:pPr>
-              <w:rPr>
-                <w:lang w:val="cs-CZ"/>
-              </w:rPr>
-            </w:pPr>
-            <w:r>
-              <w:rPr>
-                <w:sz w:val="18"/>
-                <w:szCs w:val="18"/>
-                <w:lang w:val="cs-CZ"/>
-              </w:rPr>
-              <w:t>Vysoká</w:t>
-            </w:r>
-          </w:p>
-        </w:tc>
-        <w:tc>
-          <w:tcPr>
-            <w:tcW w:w="2200" w:type="dxa"/>
-            <w:tcBorders>
-              <w:top w:val="single" w:sz="1" w:space="0" w:color="CCCCCC"/>
-              <w:left w:val="single" w:sz="1" w:space="0" w:color="CCCCCC"/>
-              <w:bottom w:val="single" w:sz="1" w:space="0" w:color="CCCCCC"/>
-              <w:right w:val="single" w:sz="1" w:space="0" w:color="CCCCCC"/>
-            </w:tcBorders>
-            <w:shd w:val="clear" w:color="auto" w:fill="FFFFFF"/>
-            <w:tcMar>
-              <w:top w:w="80" w:type="dxa"/>
-              <w:left w:w="120" w:type="dxa"/>
-              <w:bottom w:w="80" w:type="dxa"/>
-              <w:right w:w="120" w:type="dxa"/>
-            </w:tcMar>
-          </w:tcPr>
-          <w:p>
-            <w:pPr>
-              <w:rPr>
-                <w:lang w:val="cs-CZ"/>
-              </w:rPr>
-            </w:pPr>
-            <w:r>
-              <w:rPr>
-                <w:sz w:val="18"/>
-                <w:szCs w:val="18"/>
-                <w:lang w:val="cs-CZ"/>
-              </w:rPr>
-              <w:t>Bez poplatků, ale dlouhá splatnost a kreditní riziko.</w:t>
-            </w:r>
-          </w:p>
-        </w:tc>
-        <w:tc>
-          <w:tcPr>
-            <w:tcW w:w="1400" w:type="dxa"/>
-            <w:tcBorders>
-              <w:top w:val="single" w:sz="1" w:space="0" w:color="CCCCCC"/>
-              <w:left w:val="single" w:sz="1" w:space="0" w:color="CCCCCC"/>
-              <w:bottom w:val="single" w:sz="1" w:space="0" w:color="CCCCCC"/>
-              <w:right w:val="single" w:sz="1" w:space="0" w:color="CCCCCC"/>
-            </w:tcBorders>
-            <w:shd w:val="clear" w:color="auto" w:fill="FFFFFF"/>
-            <w:tcMar>
-              <w:top w:w="80" w:type="dxa"/>
-              <w:left w:w="120" w:type="dxa"/>
-              <w:bottom w:w="80" w:type="dxa"/>
-              <w:right w:w="120" w:type="dxa"/>
-            </w:tcMar>
-          </w:tcPr>
-          <w:p>
-            <w:pPr>
-              <w:rPr>
-                <w:lang w:val="cs-CZ"/>
-              </w:rPr>
-            </w:pPr>
-          </w:p>
-        </w:tc>
-        <w:tc>
-          <w:tcPr>
-            <w:tcW w:w="1600" w:type="dxa"/>
-            <w:tcBorders>
-              <w:top w:val="single" w:sz="1" w:space="0" w:color="CCCCCC"/>
-              <w:left w:val="single" w:sz="1" w:space="0" w:color="CCCCCC"/>
-              <w:bottom w:val="single" w:sz="1" w:space="0" w:color="CCCCCC"/>
-              <w:right w:val="single" w:sz="1" w:space="0" w:color="CCCCCC"/>
-            </w:tcBorders>
-            <w:shd w:val="clear" w:color="auto" w:fill="FFFFFF"/>
-            <w:tcMar>
-              <w:top w:w="80" w:type="dxa"/>
-              <w:left w:w="120" w:type="dxa"/>
-              <w:bottom w:w="80" w:type="dxa"/>
-              <w:right w:w="120" w:type="dxa"/>
-            </w:tcMar>
-          </w:tcPr>
-          <w:p>
-            <w:pPr>
-              <w:rPr>
+          </w:tcPr>
+          <w:p>
+            <w:pPr>
+              <w:rPr>
+                <w:sz w:val="18"/>
+                <w:szCs w:val="18"/>
                 <w:lang w:val="cs-CZ"/>
               </w:rPr>
             </w:pPr>
@@ -1545,7 +1669,43 @@
           <w:szCs w:val="17"/>
           <w:lang w:val="cs-CZ"/>
         </w:rPr>
-        <w:t>*Poplatky za korporátní karty jsou výrazně vyšší než u běžných spotřebitelských karet. Obchodník obvykle platí karetnímu schématu a bance provizi v rozmezí 1,5–3 % z transakce, zatímco u běžných debetních karet jde často jen o 0,2–0,3 %. Vyšší náklad je dán tím, že korporátní karty nejsou regulované stropy interchange fee dle nařízení EU 2015/751. Z pohledu e-shopu proto platby těmito kartami významně snižují marži, a u velkoobjemových B2B objednávek se často preferuje bankovní převod či fakturace.</w:t>
+        <w:t xml:space="preserve">*Poplatky za korporátní karty jsou výrazně vyšší než u běžných spotřebitelských karet. Obchodník obvykle platí karetnímu schématu a bance provizi v rozmezí 1,5–3 % z transakce, zatímco u běžných debetních karet jde často jen o 0,2–0,3 %. Vyšší náklad je dán tím, že korporátní karty nejsou regulované stropy </w:t>
+      </w:r>
+      <w:proofErr w:type="spellStart"/>
+      <w:r>
+        <w:rPr>
+          <w:sz w:val="17"/>
+          <w:szCs w:val="17"/>
+          <w:lang w:val="cs-CZ"/>
+        </w:rPr>
+        <w:t>interchange</w:t>
+      </w:r>
+      <w:proofErr w:type="spellEnd"/>
+      <w:r>
+        <w:rPr>
+          <w:sz w:val="17"/>
+          <w:szCs w:val="17"/>
+          <w:lang w:val="cs-CZ"/>
+        </w:rPr>
+        <w:t xml:space="preserve"> </w:t>
+      </w:r>
+      <w:proofErr w:type="spellStart"/>
+      <w:r>
+        <w:rPr>
+          <w:sz w:val="17"/>
+          <w:szCs w:val="17"/>
+          <w:lang w:val="cs-CZ"/>
+        </w:rPr>
+        <w:t>fee</w:t>
+      </w:r>
+      <w:proofErr w:type="spellEnd"/>
+      <w:r>
+        <w:rPr>
+          <w:sz w:val="17"/>
+          <w:szCs w:val="17"/>
+          <w:lang w:val="cs-CZ"/>
+        </w:rPr>
+        <w:t xml:space="preserve"> dle nařízení EU 2015/751. Z pohledu e-shopu proto platby těmito kartami významně snižují marži, a u velkoobjemových B2B objednávek se často preferuje bankovní převod či fakturace.</w:t>
       </w:r>
     </w:p>
     <w:p>
@@ -1559,7 +1719,35 @@
         <w:rPr>
           <w:lang w:val="cs-CZ"/>
         </w:rPr>
-        <w:t>Platba kartou přináší poplatky bankám a karetním schématům (obvykle do 1 %), dobírka zvyšuje náklady na logistiku, zatímco převody a QR platby jsou levnější, ale zpomalují proces. Platby předem snižují vratkovost, protože zákazníci mají vyšší motivaci objednávku dokončit. Z pohledu cash-flow jsou nejvýhodnější karty a BNPL, kde obchodník dostane zaplaceno rychle, zatímco dobírka a faktury znamenají delší čekání na peníze.</w:t>
+        <w:t xml:space="preserve">Platba kartou přináší poplatky bankám a karetním schématům (obvykle do 1 %), dobírka zvyšuje náklady na logistiku, zatímco převody a QR platby jsou levnější, ale zpomalují proces. Platby předem snižují </w:t>
+      </w:r>
+      <w:proofErr w:type="spellStart"/>
+      <w:r>
+        <w:rPr>
+          <w:lang w:val="cs-CZ"/>
+        </w:rPr>
+        <w:t>vratkovost</w:t>
+      </w:r>
+      <w:proofErr w:type="spellEnd"/>
+      <w:r>
+        <w:rPr>
+          <w:lang w:val="cs-CZ"/>
+        </w:rPr>
+        <w:t>, protože zákazníci mají vyšší motivaci objednávku dokončit. Z pohledu cash-</w:t>
+      </w:r>
+      <w:proofErr w:type="spellStart"/>
+      <w:r>
+        <w:rPr>
+          <w:lang w:val="cs-CZ"/>
+        </w:rPr>
+        <w:t>flow</w:t>
+      </w:r>
+      <w:proofErr w:type="spellEnd"/>
+      <w:r>
+        <w:rPr>
+          <w:lang w:val="cs-CZ"/>
+        </w:rPr>
+        <w:t xml:space="preserve"> jsou nejvýhodnější karty a BNPL, kde obchodník dostane zaplaceno rychle, zatímco dobírka a faktury znamenají delší čekání na peníze.</w:t>
       </w:r>
     </w:p>
     <w:p>
@@ -1603,7 +1791,21 @@
           <w:lang w:val="cs-CZ"/>
         </w:rPr>
         <w:lastRenderedPageBreak/>
-        <w:t>Z pohledu e-shopu to má přímý dopad: bankovní převod přestává být synonymem pro čekání na platbu. Pokud zákazník platí přes okamžitou platbu nebo QR kód s okamžitým připsáním, e-shop dostane peníze do sekund – srovnatelně s kartou, ale za nižší poplatek. To mění kalkul v tabulce "Dopad na cash-flow" pro kategorii rychlých převodů.</w:t>
+        <w:t>Z pohledu e-shopu to má přímý dopad: bankovní převod přestává být synonymem pro čekání na platbu. Pokud zákazník platí přes okamžitou platbu nebo QR kód s okamžitým připsáním, e-shop dostane peníze do sekund – srovnatelně s kartou, ale za nižší poplatek. To mění kalkul v tabulce "Dopad na cash-</w:t>
+      </w:r>
+      <w:proofErr w:type="spellStart"/>
+      <w:r>
+        <w:rPr>
+          <w:lang w:val="cs-CZ"/>
+        </w:rPr>
+        <w:t>flow</w:t>
+      </w:r>
+      <w:proofErr w:type="spellEnd"/>
+      <w:r>
+        <w:rPr>
+          <w:lang w:val="cs-CZ"/>
+        </w:rPr>
+        <w:t>" pro kategorii rychlých převodů.</w:t>
       </w:r>
     </w:p>
     <w:p>
@@ -1617,7 +1819,49 @@
         <w:rPr>
           <w:lang w:val="cs-CZ"/>
         </w:rPr>
-        <w:t>A2A platby (Account-to-Account) jdou ještě dál: jde o přímé propojení bankovního účtu zákazníka a obchodníka bez zprostředkování karetního schématu. Výsledkem jsou nižší poplatky pro e-shop a okamžité vypořádání. Technicky je A2A umožněno PSD2 regulací, prakticky je v ČR zatím ve fázi zavádění – ale pro velké hráče jako Alza může jít o relevatní úsporu na objemech.</w:t>
+        <w:t>A2A platby (</w:t>
+      </w:r>
+      <w:proofErr w:type="spellStart"/>
+      <w:r>
+        <w:rPr>
+          <w:lang w:val="cs-CZ"/>
+        </w:rPr>
+        <w:t>Account</w:t>
+      </w:r>
+      <w:proofErr w:type="spellEnd"/>
+      <w:r>
+        <w:rPr>
+          <w:lang w:val="cs-CZ"/>
+        </w:rPr>
+        <w:t>-to-</w:t>
+      </w:r>
+      <w:proofErr w:type="spellStart"/>
+      <w:r>
+        <w:rPr>
+          <w:lang w:val="cs-CZ"/>
+        </w:rPr>
+        <w:t>Account</w:t>
+      </w:r>
+      <w:proofErr w:type="spellEnd"/>
+      <w:r>
+        <w:rPr>
+          <w:lang w:val="cs-CZ"/>
+        </w:rPr>
+        <w:t xml:space="preserve">) jdou ještě dál: jde o přímé propojení bankovního účtu zákazníka a obchodníka bez zprostředkování karetního schématu. Výsledkem jsou nižší poplatky pro e-shop a okamžité vypořádání. Technicky je A2A umožněno PSD2 regulací, prakticky je v ČR zatím ve fázi zavádění – ale pro velké hráče jako Alza může jít o </w:t>
+      </w:r>
+      <w:proofErr w:type="spellStart"/>
+      <w:r>
+        <w:rPr>
+          <w:lang w:val="cs-CZ"/>
+        </w:rPr>
+        <w:t>relevatní</w:t>
+      </w:r>
+      <w:proofErr w:type="spellEnd"/>
+      <w:r>
+        <w:rPr>
+          <w:lang w:val="cs-CZ"/>
+        </w:rPr>
+        <w:t xml:space="preserve"> úsporu na objemech.</w:t>
       </w:r>
     </w:p>
     <w:p>
@@ -1631,7 +1875,19 @@
         <w:rPr>
           <w:lang w:val="cs-CZ"/>
         </w:rPr>
-        <w:t xml:space="preserve">QR platbz si vedou lépe, než by naznačoval původní odhad střední konverze v tabulce: průzkum PayU ukázal, že více než </w:t>
+        <w:t>QR platb</w:t>
+      </w:r>
+      <w:r>
+        <w:rPr>
+          <w:lang w:val="cs-CZ"/>
+        </w:rPr>
+        <w:t>y</w:t>
+      </w:r>
+      <w:r>
+        <w:rPr>
+          <w:lang w:val="cs-CZ"/>
+        </w:rPr>
+        <w:t xml:space="preserve"> si vedou lépe, než by naznačoval původní odhad střední konverze v tabulce: průzkum PayU ukázal, že více než </w:t>
       </w:r>
       <w:r>
         <w:rPr>
@@ -1677,7 +1933,21 @@
         <w:rPr>
           <w:lang w:val="cs-CZ"/>
         </w:rPr>
-        <w:t>Rozhodnutí zákazníka, jak zaplatí, není jen ekonomické, ale i psychologické. Lidé se vyhýbají „bolesti z placení“ – proto preferují metody, kde je výdaj méně viditelný a rychlý (např. Apple Pay). Každý dodatečný krok v platbě zvyšuje riziko, že zákazník nákup nedokončí. Zákazníci navíc reagují citlivě na příplatky za dopravu či dobírku a často vnímají i malý poplatek jako nefér. Z pohledu obchodníka proto není cílem mít nejlevnější platbu, ale takovou, která minimalizuje tření, maximalizuje konverzi a působí férově.</w:t>
+        <w:t xml:space="preserve">Rozhodnutí zákazníka, jak zaplatí, není jen ekonomické, ale i psychologické. Lidé se vyhýbají „bolesti z placení“ – proto preferují metody, kde je výdaj méně viditelný a rychlý (např. Apple </w:t>
+      </w:r>
+      <w:proofErr w:type="spellStart"/>
+      <w:r>
+        <w:rPr>
+          <w:lang w:val="cs-CZ"/>
+        </w:rPr>
+        <w:t>Pay</w:t>
+      </w:r>
+      <w:proofErr w:type="spellEnd"/>
+      <w:r>
+        <w:rPr>
+          <w:lang w:val="cs-CZ"/>
+        </w:rPr>
+        <w:t>). Každý dodatečný krok v platbě zvyšuje riziko, že zákazník nákup nedokončí. Zákazníci navíc reagují citlivě na příplatky za dopravu či dobírku a často vnímají i malý poplatek jako nefér. Z pohledu obchodníka proto není cílem mít nejlevnější platbu, ale takovou, která minimalizuje tření, maximalizuje konverzi a působí férově.</w:t>
       </w:r>
     </w:p>
     <w:p>
@@ -1697,7 +1967,77 @@
         <w:rPr>
           <w:lang w:val="cs-CZ"/>
         </w:rPr>
-        <w:t>mladší generace (18–24 let): průzkum (2025) ukazuje, že každý třetí zákazník z této skupiny by e-shop opustil, pokud by nenabízel platbu přes digitální peněženku (Google Pay, Apple Pay, Click to Pay). Spolu s tím, že v roce 2024 poprvé dominovaly mobilní telefony jako primární zařízení pro online nákupy v ČR (APEK, 2025), se beztřecí mobilní platba stává hygienickým standardem, nikoliv pouze výhodou.</w:t>
+        <w:t xml:space="preserve">mladší generace (18–24 let): průzkum (2025) ukazuje, že každý třetí zákazník z této skupiny by e-shop opustil, pokud by nenabízel platbu přes digitální peněženku (Google </w:t>
+      </w:r>
+      <w:proofErr w:type="spellStart"/>
+      <w:r>
+        <w:rPr>
+          <w:lang w:val="cs-CZ"/>
+        </w:rPr>
+        <w:t>Pay</w:t>
+      </w:r>
+      <w:proofErr w:type="spellEnd"/>
+      <w:r>
+        <w:rPr>
+          <w:lang w:val="cs-CZ"/>
+        </w:rPr>
+        <w:t xml:space="preserve">, Apple </w:t>
+      </w:r>
+      <w:proofErr w:type="spellStart"/>
+      <w:r>
+        <w:rPr>
+          <w:lang w:val="cs-CZ"/>
+        </w:rPr>
+        <w:t>Pay</w:t>
+      </w:r>
+      <w:proofErr w:type="spellEnd"/>
+      <w:r>
+        <w:rPr>
+          <w:lang w:val="cs-CZ"/>
+        </w:rPr>
+        <w:t xml:space="preserve">, </w:t>
+      </w:r>
+      <w:proofErr w:type="spellStart"/>
+      <w:r>
+        <w:rPr>
+          <w:lang w:val="cs-CZ"/>
+        </w:rPr>
+        <w:t>Click</w:t>
+      </w:r>
+      <w:proofErr w:type="spellEnd"/>
+      <w:r>
+        <w:rPr>
+          <w:lang w:val="cs-CZ"/>
+        </w:rPr>
+        <w:t xml:space="preserve"> to </w:t>
+      </w:r>
+      <w:proofErr w:type="spellStart"/>
+      <w:r>
+        <w:rPr>
+          <w:lang w:val="cs-CZ"/>
+        </w:rPr>
+        <w:t>Pay</w:t>
+      </w:r>
+      <w:proofErr w:type="spellEnd"/>
+      <w:r>
+        <w:rPr>
+          <w:lang w:val="cs-CZ"/>
+        </w:rPr>
+        <w:t xml:space="preserve">). Spolu s tím, že v roce 2024 poprvé dominovaly mobilní telefony jako primární zařízení pro online nákupy v ČR (APEK, 2025), se </w:t>
+      </w:r>
+      <w:proofErr w:type="spellStart"/>
+      <w:r>
+        <w:rPr>
+          <w:lang w:val="cs-CZ"/>
+        </w:rPr>
+        <w:t>beztřecí</w:t>
+      </w:r>
+      <w:proofErr w:type="spellEnd"/>
+      <w:r>
+        <w:rPr>
+          <w:lang w:val="cs-CZ"/>
+        </w:rPr>
+        <w:t xml:space="preserve"> mobilní platba stává hygienickým standardem, nikoliv pouze výhodou.</w:t>
       </w:r>
     </w:p>
     <w:p>
@@ -1721,33 +2061,103 @@
           <w:lang w:val="cs-CZ"/>
         </w:rPr>
       </w:pPr>
+      <w:proofErr w:type="spellStart"/>
       <w:r>
         <w:rPr>
           <w:b/>
           <w:bCs/>
           <w:lang w:val="cs-CZ"/>
         </w:rPr>
-        <w:t>Fraud a chargebacky.</w:t>
-      </w:r>
-      <w:r>
-        <w:rPr>
-          <w:lang w:val="cs-CZ"/>
-        </w:rPr>
-        <w:t xml:space="preserve"> Každá karetní transakce nese riziko zneužití. V případě neoprávněné reklamace (chargebacku) nese e-shop nejen ztrátu hodnoty objednávky, ale i dodatečné poplatky a administrativní náklady. Vysoký podíl podvodných transakcí může zvýšit celkové náklady platebního kanálu a poškodit reputaci obchodníka vůči bankám. </w:t>
-      </w:r>
+        <w:t>Fraud</w:t>
+      </w:r>
+      <w:proofErr w:type="spellEnd"/>
       <w:r>
         <w:rPr>
           <w:b/>
           <w:bCs/>
           <w:lang w:val="cs-CZ"/>
         </w:rPr>
+        <w:t xml:space="preserve"> a </w:t>
+      </w:r>
+      <w:proofErr w:type="spellStart"/>
+      <w:r>
+        <w:rPr>
+          <w:b/>
+          <w:bCs/>
+          <w:lang w:val="cs-CZ"/>
+        </w:rPr>
+        <w:t>chargebacky</w:t>
+      </w:r>
+      <w:proofErr w:type="spellEnd"/>
+      <w:r>
+        <w:rPr>
+          <w:b/>
+          <w:bCs/>
+          <w:lang w:val="cs-CZ"/>
+        </w:rPr>
+        <w:t>.</w:t>
+      </w:r>
+      <w:r>
+        <w:rPr>
+          <w:lang w:val="cs-CZ"/>
+        </w:rPr>
+        <w:t xml:space="preserve"> Každá karetní transakce nese riziko zneužití. V případě neoprávněné reklamace (</w:t>
+      </w:r>
+      <w:proofErr w:type="spellStart"/>
+      <w:r>
+        <w:rPr>
+          <w:lang w:val="cs-CZ"/>
+        </w:rPr>
+        <w:t>chargebacku</w:t>
+      </w:r>
+      <w:proofErr w:type="spellEnd"/>
+      <w:r>
+        <w:rPr>
+          <w:lang w:val="cs-CZ"/>
+        </w:rPr>
+        <w:t xml:space="preserve">) nese e-shop nejen ztrátu hodnoty objednávky, ale i dodatečné poplatky a administrativní náklady. Vysoký podíl podvodných transakcí může zvýšit celkové náklady platebního kanálu a poškodit reputaci obchodníka vůči bankám. </w:t>
+      </w:r>
+      <w:r>
+        <w:rPr>
+          <w:b/>
+          <w:bCs/>
+          <w:lang w:val="cs-CZ"/>
+        </w:rPr>
         <w:t>Regulace PSD2</w:t>
       </w:r>
       <w:r>
         <w:rPr>
           <w:lang w:val="cs-CZ"/>
         </w:rPr>
-        <w:t xml:space="preserve"> zavedla povinné silné ověření zákazníka (SCA) a významně snížila výskyt karetních fraudů v EU – u většiny obchodníků se pohybují pod 0,05 % všech transakcí. Fraud už tedy v Evropě není hlavním tématem, ale je nutné být obezřetný u mezinárodních plateb mimo EU, kde SCA neplatí a podvody se přesunuly právě tam.</w:t>
+        <w:t xml:space="preserve"> zavedla povinné silné ověření zákazníka (SCA) a významně snížila výskyt karetních </w:t>
+      </w:r>
+      <w:proofErr w:type="spellStart"/>
+      <w:r>
+        <w:rPr>
+          <w:lang w:val="cs-CZ"/>
+        </w:rPr>
+        <w:t>fraudů</w:t>
+      </w:r>
+      <w:proofErr w:type="spellEnd"/>
+      <w:r>
+        <w:rPr>
+          <w:lang w:val="cs-CZ"/>
+        </w:rPr>
+        <w:t xml:space="preserve"> v EU – u většiny obchodníků se pohybují pod 0,05 % všech transakcí. </w:t>
+      </w:r>
+      <w:proofErr w:type="spellStart"/>
+      <w:r>
+        <w:rPr>
+          <w:lang w:val="cs-CZ"/>
+        </w:rPr>
+        <w:t>Fraud</w:t>
+      </w:r>
+      <w:proofErr w:type="spellEnd"/>
+      <w:r>
+        <w:rPr>
+          <w:lang w:val="cs-CZ"/>
+        </w:rPr>
+        <w:t xml:space="preserve"> už tedy v Evropě není hlavním tématem, ale je nutné být obezřetný u mezinárodních plateb mimo EU, kde SCA neplatí a podvody se přesunuly právě tam.</w:t>
       </w:r>
     </w:p>
     <w:p>
@@ -1807,13 +2217,41 @@
           <w:lang w:val="cs-CZ"/>
         </w:rPr>
       </w:pPr>
+      <w:proofErr w:type="spellStart"/>
       <w:r>
         <w:rPr>
           <w:b/>
           <w:bCs/>
           <w:lang w:val="cs-CZ"/>
         </w:rPr>
-        <w:t>Multi-currency a cross-border platby.</w:t>
+        <w:t>Multi-currency</w:t>
+      </w:r>
+      <w:proofErr w:type="spellEnd"/>
+      <w:r>
+        <w:rPr>
+          <w:b/>
+          <w:bCs/>
+          <w:lang w:val="cs-CZ"/>
+        </w:rPr>
+        <w:t xml:space="preserve"> a </w:t>
+      </w:r>
+      <w:proofErr w:type="spellStart"/>
+      <w:r>
+        <w:rPr>
+          <w:b/>
+          <w:bCs/>
+          <w:lang w:val="cs-CZ"/>
+        </w:rPr>
+        <w:t>cross-border</w:t>
+      </w:r>
+      <w:proofErr w:type="spellEnd"/>
+      <w:r>
+        <w:rPr>
+          <w:b/>
+          <w:bCs/>
+          <w:lang w:val="cs-CZ"/>
+        </w:rPr>
+        <w:t xml:space="preserve"> platby.</w:t>
       </w:r>
       <w:r>
         <w:rPr>
@@ -1965,11 +2403,19 @@
           <w:lang w:val="cs-CZ"/>
         </w:rPr>
       </w:pPr>
-      <w:r>
-        <w:rPr>
-          <w:lang w:val="cs-CZ"/>
-        </w:rPr>
-        <w:t>vratkovost a nevyzvednuté zásilky,</w:t>
+      <w:proofErr w:type="spellStart"/>
+      <w:r>
+        <w:rPr>
+          <w:lang w:val="cs-CZ"/>
+        </w:rPr>
+        <w:t>vratkovost</w:t>
+      </w:r>
+      <w:proofErr w:type="spellEnd"/>
+      <w:r>
+        <w:rPr>
+          <w:lang w:val="cs-CZ"/>
+        </w:rPr>
+        <w:t xml:space="preserve"> a nevyzvednuté zásilky,</w:t>
       </w:r>
     </w:p>
     <w:p>
@@ -1988,7 +2434,21 @@
         <w:rPr>
           <w:lang w:val="cs-CZ"/>
         </w:rPr>
-        <w:t>dopad na cash-flow,</w:t>
+        <w:t>dopad na cash-</w:t>
+      </w:r>
+      <w:proofErr w:type="spellStart"/>
+      <w:r>
+        <w:rPr>
+          <w:lang w:val="cs-CZ"/>
+        </w:rPr>
+        <w:t>flow</w:t>
+      </w:r>
+      <w:proofErr w:type="spellEnd"/>
+      <w:r>
+        <w:rPr>
+          <w:lang w:val="cs-CZ"/>
+        </w:rPr>
+        <w:t>,</w:t>
       </w:r>
     </w:p>
     <w:p>

</xml_diff>

<commit_message>
Update default reading DOCX (platebni ekonomika)
Made-with: Cursor
</commit_message>
<xml_diff>
--- a/Alza_Platebni_Ekonomika_OnePager_v2.docx
+++ b/Alza_Platebni_Ekonomika_OnePager_v2.docx
@@ -310,7 +310,7 @@
     </w:p>
     <w:tbl>
       <w:tblPr>
-        <w:tblW w:w="9744" w:type="dxa"/>
+        <w:tblW w:w="6534" w:type="dxa"/>
         <w:tblBorders>
           <w:top w:val="single" w:sz="4" w:space="0" w:color="auto"/>
           <w:left w:val="single" w:sz="4" w:space="0" w:color="auto"/>
@@ -330,8 +330,6 @@
         <w:gridCol w:w="1132"/>
         <w:gridCol w:w="1523"/>
         <w:gridCol w:w="2095"/>
-        <w:gridCol w:w="1605"/>
-        <w:gridCol w:w="1605"/>
       </w:tblGrid>
       <w:tr>
         <w:tc>
@@ -493,72 +491,6 @@
                 <w:lang w:val="cs-CZ"/>
               </w:rPr>
               <w:t xml:space="preserve"> e-shopu</w:t>
-            </w:r>
-          </w:p>
-        </w:tc>
-        <w:tc>
-          <w:tcPr>
-            <w:tcW w:w="1605" w:type="dxa"/>
-            <w:tcBorders>
-              <w:top w:val="single" w:sz="1" w:space="0" w:color="2E75B6"/>
-              <w:left w:val="single" w:sz="1" w:space="0" w:color="2E75B6"/>
-              <w:bottom w:val="single" w:sz="1" w:space="0" w:color="2E75B6"/>
-              <w:right w:val="single" w:sz="1" w:space="0" w:color="2E75B6"/>
-            </w:tcBorders>
-            <w:shd w:val="clear" w:color="auto" w:fill="D5E8F0"/>
-          </w:tcPr>
-          <w:p>
-            <w:pPr>
-              <w:rPr>
-                <w:b/>
-                <w:bCs/>
-                <w:sz w:val="18"/>
-                <w:szCs w:val="18"/>
-                <w:lang w:val="cs-CZ"/>
-              </w:rPr>
-            </w:pPr>
-            <w:r>
-              <w:rPr>
-                <w:b/>
-                <w:bCs/>
-                <w:sz w:val="18"/>
-                <w:szCs w:val="18"/>
-                <w:lang w:val="cs-CZ"/>
-              </w:rPr>
-              <w:t>Odhad podílu obratu u Alzy</w:t>
-            </w:r>
-          </w:p>
-        </w:tc>
-        <w:tc>
-          <w:tcPr>
-            <w:tcW w:w="1605" w:type="dxa"/>
-            <w:tcBorders>
-              <w:top w:val="single" w:sz="1" w:space="0" w:color="2E75B6"/>
-              <w:left w:val="single" w:sz="1" w:space="0" w:color="2E75B6"/>
-              <w:bottom w:val="single" w:sz="1" w:space="0" w:color="2E75B6"/>
-              <w:right w:val="single" w:sz="1" w:space="0" w:color="2E75B6"/>
-            </w:tcBorders>
-            <w:shd w:val="clear" w:color="auto" w:fill="D5E8F0"/>
-          </w:tcPr>
-          <w:p>
-            <w:pPr>
-              <w:rPr>
-                <w:b/>
-                <w:bCs/>
-                <w:sz w:val="18"/>
-                <w:szCs w:val="18"/>
-                <w:lang w:val="cs-CZ"/>
-              </w:rPr>
-            </w:pPr>
-            <w:r>
-              <w:rPr>
-                <w:b/>
-                <w:bCs/>
-                <w:sz w:val="18"/>
-                <w:szCs w:val="18"/>
-                <w:lang w:val="cs-CZ"/>
-              </w:rPr>
-              <w:t>Odhad konverze u Alzy</w:t>
             </w:r>
           </w:p>
         </w:tc>
@@ -714,9 +646,11 @@
             </w:r>
           </w:p>
         </w:tc>
+      </w:tr>
+      <w:tr>
         <w:tc>
           <w:tcPr>
-            <w:tcW w:w="1605" w:type="dxa"/>
+            <w:tcW w:w="1784" w:type="dxa"/>
             <w:tcBorders>
               <w:top w:val="single" w:sz="1" w:space="0" w:color="CCCCCC"/>
               <w:left w:val="single" w:sz="1" w:space="0" w:color="CCCCCC"/>
@@ -724,20 +658,32 @@
               <w:right w:val="single" w:sz="1" w:space="0" w:color="CCCCCC"/>
             </w:tcBorders>
             <w:shd w:val="clear" w:color="auto" w:fill="FFFFFF"/>
+            <w:tcMar>
+              <w:top w:w="80" w:type="dxa"/>
+              <w:left w:w="120" w:type="dxa"/>
+              <w:bottom w:w="80" w:type="dxa"/>
+              <w:right w:w="120" w:type="dxa"/>
+            </w:tcMar>
           </w:tcPr>
           <w:p>
             <w:pPr>
               <w:rPr>
+                <w:lang w:val="cs-CZ"/>
+              </w:rPr>
+            </w:pPr>
+            <w:r>
+              <w:rPr>
                 <w:sz w:val="18"/>
                 <w:szCs w:val="18"/>
                 <w:lang w:val="cs-CZ"/>
               </w:rPr>
-            </w:pPr>
+              <w:t>Rychlý bankovní převod / QR platba</w:t>
+            </w:r>
           </w:p>
         </w:tc>
         <w:tc>
           <w:tcPr>
-            <w:tcW w:w="1605" w:type="dxa"/>
+            <w:tcW w:w="1132" w:type="dxa"/>
             <w:tcBorders>
               <w:top w:val="single" w:sz="1" w:space="0" w:color="CCCCCC"/>
               <w:left w:val="single" w:sz="1" w:space="0" w:color="CCCCCC"/>
@@ -745,15 +691,93 @@
               <w:right w:val="single" w:sz="1" w:space="0" w:color="CCCCCC"/>
             </w:tcBorders>
             <w:shd w:val="clear" w:color="auto" w:fill="FFFFFF"/>
+            <w:tcMar>
+              <w:top w:w="80" w:type="dxa"/>
+              <w:left w:w="120" w:type="dxa"/>
+              <w:bottom w:w="80" w:type="dxa"/>
+              <w:right w:w="120" w:type="dxa"/>
+            </w:tcMar>
           </w:tcPr>
           <w:p>
             <w:pPr>
               <w:rPr>
+                <w:lang w:val="cs-CZ"/>
+              </w:rPr>
+            </w:pPr>
+            <w:r>
+              <w:rPr>
                 <w:sz w:val="18"/>
                 <w:szCs w:val="18"/>
                 <w:lang w:val="cs-CZ"/>
               </w:rPr>
+              <w:t>~10–20 %</w:t>
+            </w:r>
+          </w:p>
+        </w:tc>
+        <w:tc>
+          <w:tcPr>
+            <w:tcW w:w="1523" w:type="dxa"/>
+            <w:tcBorders>
+              <w:top w:val="single" w:sz="1" w:space="0" w:color="CCCCCC"/>
+              <w:left w:val="single" w:sz="1" w:space="0" w:color="CCCCCC"/>
+              <w:bottom w:val="single" w:sz="1" w:space="0" w:color="CCCCCC"/>
+              <w:right w:val="single" w:sz="1" w:space="0" w:color="CCCCCC"/>
+            </w:tcBorders>
+            <w:shd w:val="clear" w:color="auto" w:fill="FFFFFF"/>
+            <w:tcMar>
+              <w:top w:w="80" w:type="dxa"/>
+              <w:left w:w="120" w:type="dxa"/>
+              <w:bottom w:w="80" w:type="dxa"/>
+              <w:right w:w="120" w:type="dxa"/>
+            </w:tcMar>
+          </w:tcPr>
+          <w:p>
+            <w:pPr>
+              <w:rPr>
+                <w:lang w:val="cs-CZ"/>
+              </w:rPr>
             </w:pPr>
+            <w:r>
+              <w:rPr>
+                <w:sz w:val="18"/>
+                <w:szCs w:val="18"/>
+                <w:lang w:val="cs-CZ"/>
+              </w:rPr>
+              <w:t>Střední</w:t>
+            </w:r>
+          </w:p>
+        </w:tc>
+        <w:tc>
+          <w:tcPr>
+            <w:tcW w:w="2095" w:type="dxa"/>
+            <w:tcBorders>
+              <w:top w:val="single" w:sz="1" w:space="0" w:color="CCCCCC"/>
+              <w:left w:val="single" w:sz="1" w:space="0" w:color="CCCCCC"/>
+              <w:bottom w:val="single" w:sz="1" w:space="0" w:color="CCCCCC"/>
+              <w:right w:val="single" w:sz="1" w:space="0" w:color="CCCCCC"/>
+            </w:tcBorders>
+            <w:shd w:val="clear" w:color="auto" w:fill="FFFFFF"/>
+            <w:tcMar>
+              <w:top w:w="80" w:type="dxa"/>
+              <w:left w:w="120" w:type="dxa"/>
+              <w:bottom w:w="80" w:type="dxa"/>
+              <w:right w:w="120" w:type="dxa"/>
+            </w:tcMar>
+          </w:tcPr>
+          <w:p>
+            <w:pPr>
+              <w:rPr>
+                <w:lang w:val="cs-CZ"/>
+              </w:rPr>
+            </w:pPr>
+            <w:r>
+              <w:rPr>
+                <w:sz w:val="18"/>
+                <w:szCs w:val="18"/>
+                <w:lang w:val="cs-CZ"/>
+              </w:rPr>
+              <w:t>Nižší poplatky, ale riziko neprovedení platby.</w:t>
+            </w:r>
           </w:p>
         </w:tc>
       </w:tr>
@@ -787,7 +811,7 @@
                 <w:szCs w:val="18"/>
                 <w:lang w:val="cs-CZ"/>
               </w:rPr>
-              <w:t>Rychlý bankovní převod / QR platba</w:t>
+              <w:t>Dobírka (platba při převzetí)</w:t>
             </w:r>
           </w:p>
         </w:tc>
@@ -820,7 +844,7 @@
                 <w:szCs w:val="18"/>
                 <w:lang w:val="cs-CZ"/>
               </w:rPr>
-              <w:t>~10–20 %</w:t>
+              <w:t>~5–15 %</w:t>
             </w:r>
           </w:p>
         </w:tc>
@@ -853,7 +877,7 @@
                 <w:szCs w:val="18"/>
                 <w:lang w:val="cs-CZ"/>
               </w:rPr>
-              <w:t>Střední</w:t>
+              <w:t>Vysoká (pokud vyzvednou)</w:t>
             </w:r>
           </w:p>
         </w:tc>
@@ -886,50 +910,26 @@
                 <w:szCs w:val="18"/>
                 <w:lang w:val="cs-CZ"/>
               </w:rPr>
-              <w:t>Nižší poplatky, ale riziko neprovedení platby.</w:t>
+              <w:t xml:space="preserve">Peníze později, vyšší logistické náklady a </w:t>
             </w:r>
-          </w:p>
-        </w:tc>
-        <w:tc>
-          <w:tcPr>
-            <w:tcW w:w="1605" w:type="dxa"/>
-            <w:tcBorders>
-              <w:top w:val="single" w:sz="1" w:space="0" w:color="CCCCCC"/>
-              <w:left w:val="single" w:sz="1" w:space="0" w:color="CCCCCC"/>
-              <w:bottom w:val="single" w:sz="1" w:space="0" w:color="CCCCCC"/>
-              <w:right w:val="single" w:sz="1" w:space="0" w:color="CCCCCC"/>
-            </w:tcBorders>
-            <w:shd w:val="clear" w:color="auto" w:fill="FFFFFF"/>
-          </w:tcPr>
-          <w:p>
-            <w:pPr>
+            <w:proofErr w:type="spellStart"/>
+            <w:r>
               <w:rPr>
                 <w:sz w:val="18"/>
                 <w:szCs w:val="18"/>
                 <w:lang w:val="cs-CZ"/>
               </w:rPr>
-            </w:pPr>
-          </w:p>
-        </w:tc>
-        <w:tc>
-          <w:tcPr>
-            <w:tcW w:w="1605" w:type="dxa"/>
-            <w:tcBorders>
-              <w:top w:val="single" w:sz="1" w:space="0" w:color="CCCCCC"/>
-              <w:left w:val="single" w:sz="1" w:space="0" w:color="CCCCCC"/>
-              <w:bottom w:val="single" w:sz="1" w:space="0" w:color="CCCCCC"/>
-              <w:right w:val="single" w:sz="1" w:space="0" w:color="CCCCCC"/>
-            </w:tcBorders>
-            <w:shd w:val="clear" w:color="auto" w:fill="FFFFFF"/>
-          </w:tcPr>
-          <w:p>
-            <w:pPr>
+              <w:t>vratkovost</w:t>
+            </w:r>
+            <w:proofErr w:type="spellEnd"/>
+            <w:r>
               <w:rPr>
                 <w:sz w:val="18"/>
                 <w:szCs w:val="18"/>
                 <w:lang w:val="cs-CZ"/>
               </w:rPr>
-            </w:pPr>
+              <w:t>.</w:t>
+            </w:r>
           </w:p>
         </w:tc>
       </w:tr>
@@ -963,7 +963,7 @@
                 <w:szCs w:val="18"/>
                 <w:lang w:val="cs-CZ"/>
               </w:rPr>
-              <w:t>Dobírka (platba při převzetí)</w:t>
+              <w:t>BNPL / odložená platba</w:t>
             </w:r>
           </w:p>
         </w:tc>
@@ -996,7 +996,7 @@
                 <w:szCs w:val="18"/>
                 <w:lang w:val="cs-CZ"/>
               </w:rPr>
-              <w:t>~5–15 %</w:t>
+              <w:t>~3–7 %</w:t>
             </w:r>
           </w:p>
         </w:tc>
@@ -1029,7 +1029,7 @@
                 <w:szCs w:val="18"/>
                 <w:lang w:val="cs-CZ"/>
               </w:rPr>
-              <w:t>Vysoká (pokud vyzvednou)</w:t>
+              <w:t>Vysoká</w:t>
             </w:r>
           </w:p>
         </w:tc>
@@ -1062,68 +1062,8 @@
                 <w:szCs w:val="18"/>
                 <w:lang w:val="cs-CZ"/>
               </w:rPr>
-              <w:t xml:space="preserve">Peníze později, vyšší logistické náklady a </w:t>
+              <w:t>Rychlá úhrada pro e-shop, vyšší provize poskytovateli.</w:t>
             </w:r>
-            <w:proofErr w:type="spellStart"/>
-            <w:r>
-              <w:rPr>
-                <w:sz w:val="18"/>
-                <w:szCs w:val="18"/>
-                <w:lang w:val="cs-CZ"/>
-              </w:rPr>
-              <w:t>vratkovost</w:t>
-            </w:r>
-            <w:proofErr w:type="spellEnd"/>
-            <w:r>
-              <w:rPr>
-                <w:sz w:val="18"/>
-                <w:szCs w:val="18"/>
-                <w:lang w:val="cs-CZ"/>
-              </w:rPr>
-              <w:t>.</w:t>
-            </w:r>
-          </w:p>
-        </w:tc>
-        <w:tc>
-          <w:tcPr>
-            <w:tcW w:w="1605" w:type="dxa"/>
-            <w:tcBorders>
-              <w:top w:val="single" w:sz="1" w:space="0" w:color="CCCCCC"/>
-              <w:left w:val="single" w:sz="1" w:space="0" w:color="CCCCCC"/>
-              <w:bottom w:val="single" w:sz="1" w:space="0" w:color="CCCCCC"/>
-              <w:right w:val="single" w:sz="1" w:space="0" w:color="CCCCCC"/>
-            </w:tcBorders>
-            <w:shd w:val="clear" w:color="auto" w:fill="FFFFFF"/>
-          </w:tcPr>
-          <w:p>
-            <w:pPr>
-              <w:rPr>
-                <w:sz w:val="18"/>
-                <w:szCs w:val="18"/>
-                <w:lang w:val="cs-CZ"/>
-              </w:rPr>
-            </w:pPr>
-          </w:p>
-        </w:tc>
-        <w:tc>
-          <w:tcPr>
-            <w:tcW w:w="1605" w:type="dxa"/>
-            <w:tcBorders>
-              <w:top w:val="single" w:sz="1" w:space="0" w:color="CCCCCC"/>
-              <w:left w:val="single" w:sz="1" w:space="0" w:color="CCCCCC"/>
-              <w:bottom w:val="single" w:sz="1" w:space="0" w:color="CCCCCC"/>
-              <w:right w:val="single" w:sz="1" w:space="0" w:color="CCCCCC"/>
-            </w:tcBorders>
-            <w:shd w:val="clear" w:color="auto" w:fill="FFFFFF"/>
-          </w:tcPr>
-          <w:p>
-            <w:pPr>
-              <w:rPr>
-                <w:sz w:val="18"/>
-                <w:szCs w:val="18"/>
-                <w:lang w:val="cs-CZ"/>
-              </w:rPr>
-            </w:pPr>
           </w:p>
         </w:tc>
       </w:tr>
@@ -1157,7 +1097,7 @@
                 <w:szCs w:val="18"/>
                 <w:lang w:val="cs-CZ"/>
               </w:rPr>
-              <w:t>BNPL / odložená platba</w:t>
+              <w:t>Hotovost / karta na prodejně</w:t>
             </w:r>
           </w:p>
         </w:tc>
@@ -1190,7 +1130,7 @@
                 <w:szCs w:val="18"/>
                 <w:lang w:val="cs-CZ"/>
               </w:rPr>
-              <w:t>~3–7 %</w:t>
+              <w:t>Malý podíl</w:t>
             </w:r>
           </w:p>
         </w:tc>
@@ -1256,50 +1196,8 @@
                 <w:szCs w:val="18"/>
                 <w:lang w:val="cs-CZ"/>
               </w:rPr>
-              <w:t>Rychlá úhrada pro e-shop, vyšší provize poskytovateli.</w:t>
+              <w:t>Okamžitá úhrada, nutnost práce s hotovostí.</w:t>
             </w:r>
-          </w:p>
-        </w:tc>
-        <w:tc>
-          <w:tcPr>
-            <w:tcW w:w="1605" w:type="dxa"/>
-            <w:tcBorders>
-              <w:top w:val="single" w:sz="1" w:space="0" w:color="CCCCCC"/>
-              <w:left w:val="single" w:sz="1" w:space="0" w:color="CCCCCC"/>
-              <w:bottom w:val="single" w:sz="1" w:space="0" w:color="CCCCCC"/>
-              <w:right w:val="single" w:sz="1" w:space="0" w:color="CCCCCC"/>
-            </w:tcBorders>
-            <w:shd w:val="clear" w:color="auto" w:fill="FFFFFF"/>
-          </w:tcPr>
-          <w:p>
-            <w:pPr>
-              <w:rPr>
-                <w:sz w:val="18"/>
-                <w:szCs w:val="18"/>
-                <w:lang w:val="cs-CZ"/>
-              </w:rPr>
-            </w:pPr>
-          </w:p>
-        </w:tc>
-        <w:tc>
-          <w:tcPr>
-            <w:tcW w:w="1605" w:type="dxa"/>
-            <w:tcBorders>
-              <w:top w:val="single" w:sz="1" w:space="0" w:color="CCCCCC"/>
-              <w:left w:val="single" w:sz="1" w:space="0" w:color="CCCCCC"/>
-              <w:bottom w:val="single" w:sz="1" w:space="0" w:color="CCCCCC"/>
-              <w:right w:val="single" w:sz="1" w:space="0" w:color="CCCCCC"/>
-            </w:tcBorders>
-            <w:shd w:val="clear" w:color="auto" w:fill="FFFFFF"/>
-          </w:tcPr>
-          <w:p>
-            <w:pPr>
-              <w:rPr>
-                <w:sz w:val="18"/>
-                <w:szCs w:val="18"/>
-                <w:lang w:val="cs-CZ"/>
-              </w:rPr>
-            </w:pPr>
           </w:p>
         </w:tc>
       </w:tr>
@@ -1333,7 +1231,7 @@
                 <w:szCs w:val="18"/>
                 <w:lang w:val="cs-CZ"/>
               </w:rPr>
-              <w:t>Hotovost / karta na prodejně</w:t>
+              <w:t>Faktura / bankovní převod (B2B)</w:t>
             </w:r>
           </w:p>
         </w:tc>
@@ -1366,7 +1264,7 @@
                 <w:szCs w:val="18"/>
                 <w:lang w:val="cs-CZ"/>
               </w:rPr>
-              <w:t>Malý podíl</w:t>
+              <w:t>Většina B2B objemu</w:t>
             </w:r>
           </w:p>
         </w:tc>
@@ -1432,226 +1330,8 @@
                 <w:szCs w:val="18"/>
                 <w:lang w:val="cs-CZ"/>
               </w:rPr>
-              <w:t>Okamžitá úhrada, nutnost práce s hotovostí.</w:t>
-            </w:r>
-          </w:p>
-        </w:tc>
-        <w:tc>
-          <w:tcPr>
-            <w:tcW w:w="1605" w:type="dxa"/>
-            <w:tcBorders>
-              <w:top w:val="single" w:sz="1" w:space="0" w:color="CCCCCC"/>
-              <w:left w:val="single" w:sz="1" w:space="0" w:color="CCCCCC"/>
-              <w:bottom w:val="single" w:sz="1" w:space="0" w:color="CCCCCC"/>
-              <w:right w:val="single" w:sz="1" w:space="0" w:color="CCCCCC"/>
-            </w:tcBorders>
-            <w:shd w:val="clear" w:color="auto" w:fill="FFFFFF"/>
-          </w:tcPr>
-          <w:p>
-            <w:pPr>
-              <w:rPr>
-                <w:sz w:val="18"/>
-                <w:szCs w:val="18"/>
-                <w:lang w:val="cs-CZ"/>
-              </w:rPr>
-            </w:pPr>
-          </w:p>
-        </w:tc>
-        <w:tc>
-          <w:tcPr>
-            <w:tcW w:w="1605" w:type="dxa"/>
-            <w:tcBorders>
-              <w:top w:val="single" w:sz="1" w:space="0" w:color="CCCCCC"/>
-              <w:left w:val="single" w:sz="1" w:space="0" w:color="CCCCCC"/>
-              <w:bottom w:val="single" w:sz="1" w:space="0" w:color="CCCCCC"/>
-              <w:right w:val="single" w:sz="1" w:space="0" w:color="CCCCCC"/>
-            </w:tcBorders>
-            <w:shd w:val="clear" w:color="auto" w:fill="FFFFFF"/>
-          </w:tcPr>
-          <w:p>
-            <w:pPr>
-              <w:rPr>
-                <w:sz w:val="18"/>
-                <w:szCs w:val="18"/>
-                <w:lang w:val="cs-CZ"/>
-              </w:rPr>
-            </w:pPr>
-          </w:p>
-        </w:tc>
-      </w:tr>
-      <w:tr>
-        <w:tc>
-          <w:tcPr>
-            <w:tcW w:w="1784" w:type="dxa"/>
-            <w:tcBorders>
-              <w:top w:val="single" w:sz="1" w:space="0" w:color="CCCCCC"/>
-              <w:left w:val="single" w:sz="1" w:space="0" w:color="CCCCCC"/>
-              <w:bottom w:val="single" w:sz="1" w:space="0" w:color="CCCCCC"/>
-              <w:right w:val="single" w:sz="1" w:space="0" w:color="CCCCCC"/>
-            </w:tcBorders>
-            <w:shd w:val="clear" w:color="auto" w:fill="FFFFFF"/>
-            <w:tcMar>
-              <w:top w:w="80" w:type="dxa"/>
-              <w:left w:w="120" w:type="dxa"/>
-              <w:bottom w:w="80" w:type="dxa"/>
-              <w:right w:w="120" w:type="dxa"/>
-            </w:tcMar>
-          </w:tcPr>
-          <w:p>
-            <w:pPr>
-              <w:rPr>
-                <w:lang w:val="cs-CZ"/>
-              </w:rPr>
-            </w:pPr>
-            <w:r>
-              <w:rPr>
-                <w:sz w:val="18"/>
-                <w:szCs w:val="18"/>
-                <w:lang w:val="cs-CZ"/>
-              </w:rPr>
-              <w:t>Faktura / bankovní převod (B2B)</w:t>
-            </w:r>
-          </w:p>
-        </w:tc>
-        <w:tc>
-          <w:tcPr>
-            <w:tcW w:w="1132" w:type="dxa"/>
-            <w:tcBorders>
-              <w:top w:val="single" w:sz="1" w:space="0" w:color="CCCCCC"/>
-              <w:left w:val="single" w:sz="1" w:space="0" w:color="CCCCCC"/>
-              <w:bottom w:val="single" w:sz="1" w:space="0" w:color="CCCCCC"/>
-              <w:right w:val="single" w:sz="1" w:space="0" w:color="CCCCCC"/>
-            </w:tcBorders>
-            <w:shd w:val="clear" w:color="auto" w:fill="FFFFFF"/>
-            <w:tcMar>
-              <w:top w:w="80" w:type="dxa"/>
-              <w:left w:w="120" w:type="dxa"/>
-              <w:bottom w:w="80" w:type="dxa"/>
-              <w:right w:w="120" w:type="dxa"/>
-            </w:tcMar>
-          </w:tcPr>
-          <w:p>
-            <w:pPr>
-              <w:rPr>
-                <w:lang w:val="cs-CZ"/>
-              </w:rPr>
-            </w:pPr>
-            <w:r>
-              <w:rPr>
-                <w:sz w:val="18"/>
-                <w:szCs w:val="18"/>
-                <w:lang w:val="cs-CZ"/>
-              </w:rPr>
-              <w:t>Většina B2B objemu</w:t>
-            </w:r>
-          </w:p>
-        </w:tc>
-        <w:tc>
-          <w:tcPr>
-            <w:tcW w:w="1523" w:type="dxa"/>
-            <w:tcBorders>
-              <w:top w:val="single" w:sz="1" w:space="0" w:color="CCCCCC"/>
-              <w:left w:val="single" w:sz="1" w:space="0" w:color="CCCCCC"/>
-              <w:bottom w:val="single" w:sz="1" w:space="0" w:color="CCCCCC"/>
-              <w:right w:val="single" w:sz="1" w:space="0" w:color="CCCCCC"/>
-            </w:tcBorders>
-            <w:shd w:val="clear" w:color="auto" w:fill="FFFFFF"/>
-            <w:tcMar>
-              <w:top w:w="80" w:type="dxa"/>
-              <w:left w:w="120" w:type="dxa"/>
-              <w:bottom w:w="80" w:type="dxa"/>
-              <w:right w:w="120" w:type="dxa"/>
-            </w:tcMar>
-          </w:tcPr>
-          <w:p>
-            <w:pPr>
-              <w:rPr>
-                <w:lang w:val="cs-CZ"/>
-              </w:rPr>
-            </w:pPr>
-            <w:r>
-              <w:rPr>
-                <w:sz w:val="18"/>
-                <w:szCs w:val="18"/>
-                <w:lang w:val="cs-CZ"/>
-              </w:rPr>
-              <w:t>Vysoká</w:t>
-            </w:r>
-          </w:p>
-        </w:tc>
-        <w:tc>
-          <w:tcPr>
-            <w:tcW w:w="2095" w:type="dxa"/>
-            <w:tcBorders>
-              <w:top w:val="single" w:sz="1" w:space="0" w:color="CCCCCC"/>
-              <w:left w:val="single" w:sz="1" w:space="0" w:color="CCCCCC"/>
-              <w:bottom w:val="single" w:sz="1" w:space="0" w:color="CCCCCC"/>
-              <w:right w:val="single" w:sz="1" w:space="0" w:color="CCCCCC"/>
-            </w:tcBorders>
-            <w:shd w:val="clear" w:color="auto" w:fill="FFFFFF"/>
-            <w:tcMar>
-              <w:top w:w="80" w:type="dxa"/>
-              <w:left w:w="120" w:type="dxa"/>
-              <w:bottom w:w="80" w:type="dxa"/>
-              <w:right w:w="120" w:type="dxa"/>
-            </w:tcMar>
-          </w:tcPr>
-          <w:p>
-            <w:pPr>
-              <w:rPr>
-                <w:lang w:val="cs-CZ"/>
-              </w:rPr>
-            </w:pPr>
-            <w:r>
-              <w:rPr>
-                <w:sz w:val="18"/>
-                <w:szCs w:val="18"/>
-                <w:lang w:val="cs-CZ"/>
-              </w:rPr>
               <w:t>Bez poplatků, ale dlouhá splatnost a kreditní riziko.</w:t>
             </w:r>
-          </w:p>
-        </w:tc>
-        <w:tc>
-          <w:tcPr>
-            <w:tcW w:w="1605" w:type="dxa"/>
-            <w:tcBorders>
-              <w:top w:val="single" w:sz="1" w:space="0" w:color="CCCCCC"/>
-              <w:left w:val="single" w:sz="1" w:space="0" w:color="CCCCCC"/>
-              <w:bottom w:val="single" w:sz="1" w:space="0" w:color="CCCCCC"/>
-              <w:right w:val="single" w:sz="1" w:space="0" w:color="CCCCCC"/>
-            </w:tcBorders>
-            <w:shd w:val="clear" w:color="auto" w:fill="FFFFFF"/>
-          </w:tcPr>
-          <w:p>
-            <w:pPr>
-              <w:rPr>
-                <w:sz w:val="18"/>
-                <w:szCs w:val="18"/>
-                <w:lang w:val="cs-CZ"/>
-              </w:rPr>
-            </w:pPr>
-          </w:p>
-        </w:tc>
-        <w:tc>
-          <w:tcPr>
-            <w:tcW w:w="1605" w:type="dxa"/>
-            <w:tcBorders>
-              <w:top w:val="single" w:sz="1" w:space="0" w:color="CCCCCC"/>
-              <w:left w:val="single" w:sz="1" w:space="0" w:color="CCCCCC"/>
-              <w:bottom w:val="single" w:sz="1" w:space="0" w:color="CCCCCC"/>
-              <w:right w:val="single" w:sz="1" w:space="0" w:color="CCCCCC"/>
-            </w:tcBorders>
-            <w:shd w:val="clear" w:color="auto" w:fill="FFFFFF"/>
-          </w:tcPr>
-          <w:p>
-            <w:pPr>
-              <w:rPr>
-                <w:sz w:val="18"/>
-                <w:szCs w:val="18"/>
-                <w:lang w:val="cs-CZ"/>
-              </w:rPr>
-            </w:pPr>
           </w:p>
         </w:tc>
       </w:tr>
@@ -2157,7 +1837,13 @@
         <w:rPr>
           <w:lang w:val="cs-CZ"/>
         </w:rPr>
-        <w:t xml:space="preserve"> už tedy v Evropě není hlavním tématem, ale je nutné být obezřetný u mezinárodních plateb mimo EU, kde SCA neplatí a podvody se přesunuly právě tam.</w:t>
+        <w:t xml:space="preserve"> už ted</w:t>
+      </w:r>
+      <w:r>
+        <w:rPr>
+          <w:lang w:val="cs-CZ"/>
+        </w:rPr>
+        <w:t>y v Evropě není hlavním tématem, ale je nutné být obezřetný u mezinárodních plateb mimo EU, kde SCA neplatí a podvody se přesunuly právě tam.</w:t>
       </w:r>
     </w:p>
     <w:p>
@@ -2280,209 +1966,6 @@
           <w:lang w:val="cs-CZ"/>
         </w:rPr>
         <w:t>Připravovaná směrnice PSD3 (očekávaný vstup v platnost cca 2026–2027) dále rozšiřuje rámec PSD2: přísnější ochrana zákazníka, širší přístup k finančním datům a nižší bariéry pro A2A platby. Pro e-shopy to v praxi znamená větší tlak na diverzifikaci platebních metod a zároveň příležitost snížit závislost na drahých karetních schématech. Povinné okamžité SEPA platby v ČR budou muset banky zavést do roku 2027.</w:t>
-      </w:r>
-    </w:p>
-    <w:p>
-      <w:pPr>
-        <w:pStyle w:val="Heading2"/>
-        <w:rPr>
-          <w:lang w:val="cs-CZ"/>
-        </w:rPr>
-      </w:pPr>
-      <w:r>
-        <w:rPr>
-          <w:lang w:val="cs-CZ"/>
-        </w:rPr>
-        <w:t>Otázky k diskusi</w:t>
-      </w:r>
-    </w:p>
-    <w:p>
-      <w:pPr>
-        <w:pStyle w:val="ListParagraph"/>
-        <w:numPr>
-          <w:ilvl w:val="0"/>
-          <w:numId w:val="2"/>
-        </w:numPr>
-        <w:spacing w:after="80"/>
-        <w:rPr>
-          <w:lang w:val="cs-CZ"/>
-        </w:rPr>
-      </w:pPr>
-      <w:r>
-        <w:rPr>
-          <w:lang w:val="cs-CZ"/>
-        </w:rPr>
-        <w:t>Podívejte se na tabulku platebních metod v textu a zkuste doplnit:</w:t>
-      </w:r>
-    </w:p>
-    <w:p>
-      <w:pPr>
-        <w:pStyle w:val="ListParagraph"/>
-        <w:numPr>
-          <w:ilvl w:val="0"/>
-          <w:numId w:val="3"/>
-        </w:numPr>
-        <w:spacing w:after="40"/>
-        <w:rPr>
-          <w:lang w:val="cs-CZ"/>
-        </w:rPr>
-      </w:pPr>
-      <w:r>
-        <w:rPr>
-          <w:lang w:val="cs-CZ"/>
-        </w:rPr>
-        <w:t>realistický podíl jednotlivých metod pro velký český e-shop,</w:t>
-      </w:r>
-    </w:p>
-    <w:p>
-      <w:pPr>
-        <w:pStyle w:val="ListParagraph"/>
-        <w:numPr>
-          <w:ilvl w:val="0"/>
-          <w:numId w:val="3"/>
-        </w:numPr>
-        <w:spacing w:after="120"/>
-        <w:rPr>
-          <w:lang w:val="cs-CZ"/>
-        </w:rPr>
-      </w:pPr>
-      <w:r>
-        <w:rPr>
-          <w:lang w:val="cs-CZ"/>
-        </w:rPr>
-        <w:t>odhad konverze (nejvyšší / vysoká / střední / nízká).</w:t>
-      </w:r>
-    </w:p>
-    <w:p>
-      <w:pPr>
-        <w:pStyle w:val="ListParagraph"/>
-        <w:numPr>
-          <w:ilvl w:val="0"/>
-          <w:numId w:val="2"/>
-        </w:numPr>
-        <w:spacing w:after="80"/>
-        <w:rPr>
-          <w:lang w:val="cs-CZ"/>
-        </w:rPr>
-      </w:pPr>
-      <w:r>
-        <w:rPr>
-          <w:lang w:val="cs-CZ"/>
-        </w:rPr>
-        <w:t>Seřaďte podle důležitosti z pohledu e-shopu:</w:t>
-      </w:r>
-    </w:p>
-    <w:p>
-      <w:pPr>
-        <w:pStyle w:val="ListParagraph"/>
-        <w:numPr>
-          <w:ilvl w:val="0"/>
-          <w:numId w:val="3"/>
-        </w:numPr>
-        <w:spacing w:after="40"/>
-        <w:rPr>
-          <w:lang w:val="cs-CZ"/>
-        </w:rPr>
-      </w:pPr>
-      <w:r>
-        <w:rPr>
-          <w:lang w:val="cs-CZ"/>
-        </w:rPr>
-        <w:t>nákladovost platební metody,</w:t>
-      </w:r>
-    </w:p>
-    <w:p>
-      <w:pPr>
-        <w:pStyle w:val="ListParagraph"/>
-        <w:numPr>
-          <w:ilvl w:val="0"/>
-          <w:numId w:val="3"/>
-        </w:numPr>
-        <w:spacing w:after="40"/>
-        <w:rPr>
-          <w:lang w:val="cs-CZ"/>
-        </w:rPr>
-      </w:pPr>
-      <w:proofErr w:type="spellStart"/>
-      <w:r>
-        <w:rPr>
-          <w:lang w:val="cs-CZ"/>
-        </w:rPr>
-        <w:t>vratkovost</w:t>
-      </w:r>
-      <w:proofErr w:type="spellEnd"/>
-      <w:r>
-        <w:rPr>
-          <w:lang w:val="cs-CZ"/>
-        </w:rPr>
-        <w:t xml:space="preserve"> a nevyzvednuté zásilky,</w:t>
-      </w:r>
-    </w:p>
-    <w:p>
-      <w:pPr>
-        <w:pStyle w:val="ListParagraph"/>
-        <w:numPr>
-          <w:ilvl w:val="0"/>
-          <w:numId w:val="3"/>
-        </w:numPr>
-        <w:spacing w:after="40"/>
-        <w:rPr>
-          <w:lang w:val="cs-CZ"/>
-        </w:rPr>
-      </w:pPr>
-      <w:r>
-        <w:rPr>
-          <w:lang w:val="cs-CZ"/>
-        </w:rPr>
-        <w:t>dopad na cash-</w:t>
-      </w:r>
-      <w:proofErr w:type="spellStart"/>
-      <w:r>
-        <w:rPr>
-          <w:lang w:val="cs-CZ"/>
-        </w:rPr>
-        <w:t>flow</w:t>
-      </w:r>
-      <w:proofErr w:type="spellEnd"/>
-      <w:r>
-        <w:rPr>
-          <w:lang w:val="cs-CZ"/>
-        </w:rPr>
-        <w:t>,</w:t>
-      </w:r>
-    </w:p>
-    <w:p>
-      <w:pPr>
-        <w:pStyle w:val="ListParagraph"/>
-        <w:numPr>
-          <w:ilvl w:val="0"/>
-          <w:numId w:val="3"/>
-        </w:numPr>
-        <w:spacing w:after="120"/>
-        <w:rPr>
-          <w:lang w:val="cs-CZ"/>
-        </w:rPr>
-      </w:pPr>
-      <w:r>
-        <w:rPr>
-          <w:lang w:val="cs-CZ"/>
-        </w:rPr>
-        <w:t>zákaznická zkušenost.</w:t>
-      </w:r>
-    </w:p>
-    <w:p>
-      <w:pPr>
-        <w:spacing w:after="80"/>
-        <w:rPr>
-          <w:lang w:val="cs-CZ"/>
-        </w:rPr>
-      </w:pPr>
-      <w:r>
-        <w:rPr>
-          <w:lang w:val="cs-CZ"/>
-        </w:rPr>
-        <w:lastRenderedPageBreak/>
-        <w:t>Krátce zdůvodněte své pořadí z ekonomického pohledu.</w:t>
       </w:r>
     </w:p>
     <w:sectPr>

</xml_diff>